<commit_message>
docs: add game_clock_state cache gap and REDIS_URL to TODO
</commit_message>
<xml_diff>
--- a/Resources/TODO.docx
+++ b/Resources/TODO.docx
@@ -12,19 +12,7 @@
     </w:p>
     <w:p>
       <w:r>
-        <w:rPr>
-          <w:b w:val="0"/>
-        </w:rPr>
-        <w:t xml:space="preserve">Last updated: </w:t>
-      </w:r>
-      <w:r>
-        <w:rPr>
-          <w:b/>
-        </w:rPr>
-        <w:t>2026-07-01</w:t>
-      </w:r>
-      <w:r>
-        <w:t xml:space="preserve">   |   Author: Dustin Nguyen — SMASH Research Lab, UF</w:t>
+        <w:t>Last updated: 2026-07-02   |   Author: Dustin Nguyen — SMASH Research Lab, UF</w:t>
       </w:r>
     </w:p>
     <w:p/>
@@ -1247,10 +1235,87 @@
     </w:tbl>
     <w:p>
       <w:pPr>
+        <w:pStyle w:val="Heading2"/>
+      </w:pPr>
+      <w:r>
+        <w:t>5.1  game_clock_state cache never populated</w:t>
+      </w:r>
+    </w:p>
+    <w:p>
+      <w:pPr/>
+      <w:r>
+        <w:t>get_game_clock_state() in app/utils.py is architecturally correct and stamped on every phone_telemetry and engagement_log row at ingest time. However, no Celery task currently populates the uf_football_games_{year} key in Redis. As a result, every event is stamped game_clock_state="pre" (cache miss fallback). This is acceptable during development but must be resolved before the season starts.</w:t>
+      </w:r>
+    </w:p>
+    <w:p>
+      <w:pPr/>
+      <w:r>
+        <w:t>What needs to be built:</w:t>
+      </w:r>
+    </w:p>
+    <w:p>
+      <w:pPr>
+        <w:pStyle w:val="ListBullet"/>
+      </w:pPr>
+      <w:r>
+        <w:t>A new Celery task (e.g. refresh_game_schedule) that fetches the UF football schedule from the CFBD API and writes it to cache.set("uf_football_games_{year}", games_list, timeout=86400)</w:t>
+      </w:r>
+    </w:p>
+    <w:p>
+      <w:pPr>
+        <w:pStyle w:val="ListBullet"/>
+      </w:pPr>
+      <w:r>
+        <w:t>The task should run once daily (Celery Beat) and also be triggerable manually before each game week</w:t>
+      </w:r>
+    </w:p>
+    <w:p>
+      <w:pPr>
+        <w:pStyle w:val="ListBullet"/>
+      </w:pPr>
+      <w:r>
+        <w:t>Each game entry must include a timezone-aware startDate datetime so get_game_clock_state() can compare it against datetime.now(utc)</w:t>
+      </w:r>
+    </w:p>
+    <w:p>
+      <w:pPr>
+        <w:pStyle w:val="ListBullet"/>
+      </w:pPr>
+      <w:r>
+        <w:t>CFBD_API_KEY must be added as a Heroku config var (already imported in utils.py as cfbd)</w:t>
+      </w:r>
+    </w:p>
+    <w:p>
+      <w:pPr/>
+      <w:r>
+        <w:t>Deadline: must be live before the first UF home game (late August 2026). Without it, all game_clock_state values in the research dataset will be "pre" for the entire season.</w:t>
+      </w:r>
+    </w:p>
+    <w:p>
+      <w:pPr/>
+    </w:p>
+    <w:p>
+      <w:pPr>
         <w:pStyle w:val="Heading1"/>
       </w:pPr>
       <w:r>
         <w:t>6  Environment Variables Required (Not Yet Set in Heroku)</w:t>
+      </w:r>
+    </w:p>
+    <w:p>
+      <w:pPr>
+        <w:pStyle w:val="ListBullet"/>
+      </w:pPr>
+      <w:r>
+        <w:t>REDIS_URL — Heroku Redis add-on URL. Required for get_game_clock_state() cache and Celery broker. Without it Django falls back to redis://localhost:6379/0 which does not exist on Heroku web dynos, causing 500 errors on /telemetry/phone/ and /telemetry/engagement/. Verify with: heroku config:get REDIS_URL</w:t>
+      </w:r>
+    </w:p>
+    <w:p>
+      <w:pPr>
+        <w:pStyle w:val="ListBullet"/>
+      </w:pPr>
+      <w:r>
+        <w:t>CFBD_API_KEY — College Football Data API key. Required by the forthcoming refresh_game_schedule task (see 5.1). Not yet needed but should be added before season.</w:t>
       </w:r>
     </w:p>
     <w:tbl>

</xml_diff>

<commit_message>
Update TODO with 2026-07-31 mobile gap re-review
Adds the mobile app gap list from today's re-review (build failure,
orphaned legacy code, Expo Go/push notification config gaps, receipt
round trip half-fixed) to the top of the doc. Prunes three items already
resolved on main: multi-prompt support (CSV catalog exists now), the
stuck-pending-on-no-token bug (now explicitly marked failed), and the
prompt-library open question.
</commit_message>
<xml_diff>
--- a/Resources/TODO.docx
+++ b/Resources/TODO.docx
@@ -12,7 +12,22 @@
     </w:p>
     <w:p>
       <w:r>
-        <w:t>Last updated: 2026-07-02   |   Author: Dustin Nguyen — SMASH Research Lab, UF</w:t>
+        <w:rPr>
+          <w:b/>
+        </w:rPr>
+        <w:t>Last updated:</w:t>
+      </w:r>
+      <w:r>
+        <w:t xml:space="preserve"> 2026-07-31 </w:t>
+      </w:r>
+      <w:r>
+        <w:rPr>
+          <w:b/>
+        </w:rPr>
+        <w:t>Author:</w:t>
+      </w:r>
+      <w:r>
+        <w:t xml:space="preserve"> Dustin Nguyen — SMASH Research Lab, UF</w:t>
       </w:r>
     </w:p>
     <w:p/>
@@ -21,7 +36,52 @@
         <w:pStyle w:val="Heading1"/>
       </w:pPr>
       <w:r>
-        <w:t>1  Blocked on External Deliverable</w:t>
+        <w:t>Mobile App Gaps (2026-07-31 re-review)</w:t>
+      </w:r>
+    </w:p>
+    <w:p>
+      <w:r>
+        <w:t xml:space="preserve">Sai's real mobile app is now merged into </w:t>
+      </w:r>
+      <w:r>
+        <w:rPr>
+          <w:rFonts w:ascii="Consolas" w:hAnsi="Consolas"/>
+          <w:sz w:val="20"/>
+        </w:rPr>
+        <w:t>main</w:t>
+      </w:r>
+      <w:r>
+        <w:t xml:space="preserve"> (via </w:t>
+      </w:r>
+      <w:r>
+        <w:rPr>
+          <w:rFonts w:ascii="Consolas" w:hAnsi="Consolas"/>
+          <w:sz w:val="20"/>
+        </w:rPr>
+        <w:t>mobile-only-update</w:t>
+      </w:r>
+      <w:r>
+        <w:t xml:space="preserve"> → </w:t>
+      </w:r>
+      <w:r>
+        <w:rPr>
+          <w:rFonts w:ascii="Consolas" w:hAnsi="Consolas"/>
+          <w:sz w:val="20"/>
+        </w:rPr>
+        <w:t>mobile-app-gaps</w:t>
+      </w:r>
+      <w:r>
+        <w:t xml:space="preserve"> → PR #25, 2026-07-30/31). Full writeup: </w:t>
+      </w:r>
+      <w:r>
+        <w:rPr>
+          <w:rFonts w:ascii="Consolas" w:hAnsi="Consolas"/>
+          <w:sz w:val="20"/>
+        </w:rPr>
+        <w:t>docs/sai-handover-review-2026-07-28.md</w:t>
+      </w:r>
+      <w:r>
+        <w:t xml:space="preserve"> (see the "Update — 2026-07-31" section at the top). Ordered by severity:</w:t>
       </w:r>
     </w:p>
     <w:p>
@@ -29,118 +89,515 @@
         <w:pStyle w:val="Heading2"/>
       </w:pPr>
       <w:r>
-        <w:t>1.1  Labfront API Integration</w:t>
+        <w:t>The app does not build</w:t>
       </w:r>
     </w:p>
-    <w:tbl>
-      <w:tblPr>
-        <w:tblStyle w:val="TableGrid"/>
-        <w:tblW w:type="auto" w:w="0"/>
-        <w:tblLook w:firstColumn="1" w:firstRow="1" w:lastColumn="0" w:lastRow="0" w:noHBand="0" w:noVBand="1" w:val="04A0"/>
-      </w:tblPr>
-      <w:tblGrid>
-        <w:gridCol w:w="4320"/>
-        <w:gridCol w:w="4320"/>
-      </w:tblGrid>
-      <w:tr>
-        <w:tc>
-          <w:tcPr>
-            <w:tcW w:type="dxa" w:w="4320"/>
-          </w:tcPr>
-          <w:p>
-            <w:r>
-              <w:rPr>
-                <w:b/>
-              </w:rPr>
-              <w:t>Field</w:t>
-            </w:r>
-          </w:p>
-        </w:tc>
-        <w:tc>
-          <w:tcPr>
-            <w:tcW w:type="dxa" w:w="4320"/>
-          </w:tcPr>
-          <w:p>
-            <w:r>
-              <w:rPr>
-                <w:b/>
-              </w:rPr>
-              <w:t>Detail</w:t>
-            </w:r>
-          </w:p>
-        </w:tc>
-      </w:tr>
-      <w:tr>
-        <w:tc>
-          <w:tcPr>
-            <w:tcW w:type="dxa" w:w="4320"/>
-          </w:tcPr>
-          <w:p>
-            <w:r>
-              <w:t>File</w:t>
-            </w:r>
-          </w:p>
-        </w:tc>
-        <w:tc>
-          <w:tcPr>
-            <w:tcW w:type="dxa" w:w="4320"/>
-          </w:tcPr>
-          <w:p>
-            <w:r>
-              <w:t>app/tasks.py → ingest_wearable_data()</w:t>
-            </w:r>
-          </w:p>
-        </w:tc>
-      </w:tr>
-      <w:tr>
-        <w:tc>
-          <w:tcPr>
-            <w:tcW w:type="dxa" w:w="4320"/>
-          </w:tcPr>
-          <w:p>
-            <w:r>
-              <w:t>Status</w:t>
-            </w:r>
-          </w:p>
-        </w:tc>
-        <w:tc>
-          <w:tcPr>
-            <w:tcW w:type="dxa" w:w="4320"/>
-          </w:tcPr>
-          <w:p>
-            <w:r>
-              <w:t>Stub — logs "not yet implemented"</w:t>
-            </w:r>
-          </w:p>
-        </w:tc>
-      </w:tr>
-      <w:tr>
-        <w:tc>
-          <w:tcPr>
-            <w:tcW w:type="dxa" w:w="4320"/>
-          </w:tcPr>
-          <w:p>
-            <w:r>
-              <w:t>Blocked by</w:t>
-            </w:r>
-          </w:p>
-        </w:tc>
-        <w:tc>
-          <w:tcPr>
-            <w:tcW w:type="dxa" w:w="4320"/>
-          </w:tcPr>
-          <w:p>
-            <w:r>
-              <w:t>Labfront API access and docs (paid add-on — pending contract confirmation with Prof. Chang)</w:t>
-            </w:r>
-          </w:p>
-        </w:tc>
-      </w:tr>
-    </w:tbl>
-    <w:p/>
     <w:p>
       <w:r>
-        <w:t>What is needed from Labfront before implementation:</w:t>
+        <w:rPr>
+          <w:b/>
+        </w:rPr>
+        <w:t>File:</w:t>
+      </w:r>
+      <w:r>
+        <w:t xml:space="preserve"> </w:t>
+      </w:r>
+      <w:r>
+        <w:rPr>
+          <w:rFonts w:ascii="Consolas" w:hAnsi="Consolas"/>
+          <w:sz w:val="20"/>
+        </w:rPr>
+        <w:t>mobile/babel.config.js</w:t>
+      </w:r>
+      <w:r>
+        <w:t xml:space="preserve"> requires </w:t>
+      </w:r>
+      <w:r>
+        <w:rPr>
+          <w:rFonts w:ascii="Consolas" w:hAnsi="Consolas"/>
+          <w:sz w:val="20"/>
+        </w:rPr>
+        <w:t>babel-preset-expo</w:t>
+      </w:r>
+      <w:r>
+        <w:t xml:space="preserve">; </w:t>
+      </w:r>
+      <w:r>
+        <w:rPr>
+          <w:rFonts w:ascii="Consolas" w:hAnsi="Consolas"/>
+          <w:sz w:val="20"/>
+        </w:rPr>
+        <w:t>mobile/package.json</w:t>
+      </w:r>
+      <w:r>
+        <w:t xml:space="preserve"> </w:t>
+      </w:r>
+      <w:r>
+        <w:rPr>
+          <w:rFonts w:ascii="Consolas" w:hAnsi="Consolas"/>
+          <w:sz w:val="20"/>
+        </w:rPr>
+        <w:t>devDependencies</w:t>
+      </w:r>
+      <w:r>
+        <w:t xml:space="preserve"> only lists </w:t>
+      </w:r>
+      <w:r>
+        <w:rPr>
+          <w:rFonts w:ascii="Consolas" w:hAnsi="Consolas"/>
+          <w:sz w:val="20"/>
+        </w:rPr>
+        <w:t>@types/react</w:t>
+      </w:r>
+      <w:r>
+        <w:t xml:space="preserve"> and </w:t>
+      </w:r>
+      <w:r>
+        <w:rPr>
+          <w:rFonts w:ascii="Consolas" w:hAnsi="Consolas"/>
+          <w:sz w:val="20"/>
+        </w:rPr>
+        <w:t>typescript</w:t>
+      </w:r>
+      <w:r>
+        <w:t xml:space="preserve">. </w:t>
+      </w:r>
+      <w:r>
+        <w:rPr>
+          <w:b/>
+        </w:rPr>
+        <w:t>Impact:</w:t>
+      </w:r>
+      <w:r>
+        <w:t xml:space="preserve"> </w:t>
+      </w:r>
+      <w:r>
+        <w:rPr>
+          <w:rFonts w:ascii="Consolas" w:hAnsi="Consolas"/>
+          <w:sz w:val="20"/>
+        </w:rPr>
+        <w:t>npx expo export</w:t>
+      </w:r>
+      <w:r>
+        <w:t xml:space="preserve"> / </w:t>
+      </w:r>
+      <w:r>
+        <w:rPr>
+          <w:rFonts w:ascii="Consolas" w:hAnsi="Consolas"/>
+          <w:sz w:val="20"/>
+        </w:rPr>
+        <w:t>npx expo start</w:t>
+      </w:r>
+      <w:r>
+        <w:t xml:space="preserve"> / any EAS build fails immediately with </w:t>
+      </w:r>
+      <w:r>
+        <w:rPr>
+          <w:rFonts w:ascii="Consolas" w:hAnsi="Consolas"/>
+          <w:sz w:val="20"/>
+        </w:rPr>
+        <w:t>Cannot find module 'babel-preset-expo'</w:t>
+      </w:r>
+      <w:r>
+        <w:t xml:space="preserve">. Nothing else about the mobile app can be verified until this is fixed. </w:t>
+      </w:r>
+      <w:r>
+        <w:rPr>
+          <w:b/>
+        </w:rPr>
+        <w:t>Fix:</w:t>
+      </w:r>
+      <w:r>
+        <w:t xml:space="preserve"> </w:t>
+      </w:r>
+      <w:r>
+        <w:rPr>
+          <w:rFonts w:ascii="Consolas" w:hAnsi="Consolas"/>
+          <w:sz w:val="20"/>
+        </w:rPr>
+        <w:t>npm install --save-dev babel-preset-expo</w:t>
+      </w:r>
+      <w:r>
+        <w:t xml:space="preserve"> in </w:t>
+      </w:r>
+      <w:r>
+        <w:rPr>
+          <w:rFonts w:ascii="Consolas" w:hAnsi="Consolas"/>
+          <w:sz w:val="20"/>
+        </w:rPr>
+        <w:t>mobile/</w:t>
+      </w:r>
+      <w:r>
+        <w:t>.</w:t>
+      </w:r>
+    </w:p>
+    <w:p>
+      <w:pPr>
+        <w:pStyle w:val="Heading2"/>
+      </w:pPr>
+      <w:r>
+        <w:t>No EMA submission anywhere (biggest functional gap)</w:t>
+      </w:r>
+    </w:p>
+    <w:p>
+      <w:r>
+        <w:rPr>
+          <w:b/>
+        </w:rPr>
+        <w:t>File:</w:t>
+      </w:r>
+      <w:r>
+        <w:t xml:space="preserve"> </w:t>
+      </w:r>
+      <w:r>
+        <w:rPr>
+          <w:rFonts w:ascii="Consolas" w:hAnsi="Consolas"/>
+          <w:sz w:val="20"/>
+        </w:rPr>
+        <w:t>mobile/src/screens/ComposeScreen.tsx</w:t>
+      </w:r>
+      <w:r>
+        <w:t xml:space="preserve"> </w:t>
+      </w:r>
+      <w:r>
+        <w:rPr>
+          <w:b/>
+        </w:rPr>
+        <w:t>Status:</w:t>
+      </w:r>
+      <w:r>
+        <w:t xml:space="preserve"> Free-text box with keystroke telemetry only; </w:t>
+      </w:r>
+      <w:r>
+        <w:rPr>
+          <w:rFonts w:ascii="Consolas" w:hAnsi="Consolas"/>
+          <w:sz w:val="20"/>
+        </w:rPr>
+        <w:t>ema.submit()</w:t>
+      </w:r>
+      <w:r>
+        <w:t xml:space="preserve"> is defined in </w:t>
+      </w:r>
+      <w:r>
+        <w:rPr>
+          <w:rFonts w:ascii="Consolas" w:hAnsi="Consolas"/>
+          <w:sz w:val="20"/>
+        </w:rPr>
+        <w:t>mobile/src/api/endpoints.ts</w:t>
+      </w:r>
+      <w:r>
+        <w:t xml:space="preserve"> and never called; no mood/stress/energy input UI exists. </w:t>
+      </w:r>
+      <w:r>
+        <w:rPr>
+          <w:b/>
+        </w:rPr>
+        <w:t>Impact:</w:t>
+      </w:r>
+      <w:r>
+        <w:t xml:space="preserve"> No real EMA data can reach the decision engine at all. </w:t>
+      </w:r>
+      <w:r>
+        <w:rPr>
+          <w:b/>
+        </w:rPr>
+        <w:t>Assigned:</w:t>
+      </w:r>
+      <w:r>
+        <w:t xml:space="preserve"> Shawnick's first task (</w:t>
+      </w:r>
+      <w:r>
+        <w:rPr>
+          <w:rFonts w:ascii="Consolas" w:hAnsi="Consolas"/>
+          <w:sz w:val="20"/>
+        </w:rPr>
+        <w:t>docs/shawnick-onboarding.md</w:t>
+      </w:r>
+      <w:r>
+        <w:t>).</w:t>
+      </w:r>
+    </w:p>
+    <w:p>
+      <w:pPr>
+        <w:pStyle w:val="Heading2"/>
+      </w:pPr>
+      <w:r>
+        <w:t>Auth token refresh is broken and fails silently</w:t>
+      </w:r>
+    </w:p>
+    <w:p>
+      <w:r>
+        <w:rPr>
+          <w:b/>
+        </w:rPr>
+        <w:t>Files:</w:t>
+      </w:r>
+      <w:r>
+        <w:t xml:space="preserve"> </w:t>
+      </w:r>
+      <w:r>
+        <w:rPr>
+          <w:rFonts w:ascii="Consolas" w:hAnsi="Consolas"/>
+          <w:sz w:val="20"/>
+        </w:rPr>
+        <w:t>mobile/src/api/client.ts</w:t>
+      </w:r>
+      <w:r>
+        <w:t xml:space="preserve">, </w:t>
+      </w:r>
+      <w:r>
+        <w:rPr>
+          <w:rFonts w:ascii="Consolas" w:hAnsi="Consolas"/>
+          <w:sz w:val="20"/>
+        </w:rPr>
+        <w:t>mobile/src/store/authStore.ts</w:t>
+      </w:r>
+      <w:r>
+        <w:t xml:space="preserve"> </w:t>
+      </w:r>
+      <w:r>
+        <w:rPr>
+          <w:b/>
+        </w:rPr>
+        <w:t>Status:</w:t>
+      </w:r>
+      <w:r>
+        <w:t xml:space="preserve"> Both call backend routes that don't exist — </w:t>
+      </w:r>
+      <w:r>
+        <w:rPr>
+          <w:rFonts w:ascii="Consolas" w:hAnsi="Consolas"/>
+          <w:sz w:val="20"/>
+        </w:rPr>
+        <w:t>/auth/token/refresh/</w:t>
+      </w:r>
+      <w:r>
+        <w:t xml:space="preserve"> and </w:t>
+      </w:r>
+      <w:r>
+        <w:rPr>
+          <w:rFonts w:ascii="Consolas" w:hAnsi="Consolas"/>
+          <w:sz w:val="20"/>
+        </w:rPr>
+        <w:t>/auth/me/</w:t>
+      </w:r>
+      <w:r>
+        <w:t xml:space="preserve"> are not registered in </w:t>
+      </w:r>
+      <w:r>
+        <w:rPr>
+          <w:rFonts w:ascii="Consolas" w:hAnsi="Consolas"/>
+          <w:sz w:val="20"/>
+        </w:rPr>
+        <w:t>backend/project/urls.py</w:t>
+      </w:r>
+      <w:r>
+        <w:t>. Access tokens expire after 30 minutes (</w:t>
+      </w:r>
+      <w:r>
+        <w:rPr>
+          <w:rFonts w:ascii="Consolas" w:hAnsi="Consolas"/>
+          <w:sz w:val="20"/>
+        </w:rPr>
+        <w:t>SIMPLE_JWT.ACCESS_TOKEN_LIFETIME</w:t>
+      </w:r>
+      <w:r>
+        <w:t xml:space="preserve">). On failure the client clears local tokens but never logs the Zustand store out, so the UI keeps showing the app as logged in while every API call 401s silently. </w:t>
+      </w:r>
+      <w:r>
+        <w:rPr>
+          <w:b/>
+        </w:rPr>
+        <w:t>Action needed:</w:t>
+      </w:r>
+      <w:r>
+        <w:t xml:space="preserve"> Design decision — add the backend endpoints, or simplify the client.</w:t>
+      </w:r>
+    </w:p>
+    <w:p>
+      <w:pPr>
+        <w:pStyle w:val="Heading2"/>
+      </w:pPr>
+      <w:r>
+        <w:t>Receipt round trip — half fixed</w:t>
+      </w:r>
+    </w:p>
+    <w:p>
+      <w:r>
+        <w:rPr>
+          <w:b/>
+        </w:rPr>
+        <w:t>Status:</w:t>
+      </w:r>
+      <w:r>
+        <w:t xml:space="preserve"> Tyler added a </w:t>
+      </w:r>
+      <w:r>
+        <w:rPr>
+          <w:rFonts w:ascii="Consolas" w:hAnsi="Consolas"/>
+          <w:sz w:val="20"/>
+        </w:rPr>
+        <w:t>POST /jitai/receipt/</w:t>
+      </w:r>
+      <w:r>
+        <w:t xml:space="preserve"> call (2026-07-31), but only inside the foreground </w:t>
+      </w:r>
+      <w:r>
+        <w:rPr>
+          <w:rFonts w:ascii="Consolas" w:hAnsi="Consolas"/>
+          <w:sz w:val="20"/>
+        </w:rPr>
+        <w:t>addNotificationReceivedListener</w:t>
+      </w:r>
+      <w:r>
+        <w:t xml:space="preserve"> (</w:t>
+      </w:r>
+      <w:r>
+        <w:rPr>
+          <w:rFonts w:ascii="Consolas" w:hAnsi="Consolas"/>
+          <w:sz w:val="20"/>
+        </w:rPr>
+        <w:t>mobile/App.tsx</w:t>
+      </w:r>
+      <w:r>
+        <w:t>). The tap/response listener — phone elsewhere, participant taps the notification later — still only logs engagement, never posts a receipt. Given these are silent, data-only pushes, the foreground path may rarely fire in practice, especially on iOS.</w:t>
+      </w:r>
+    </w:p>
+    <w:p>
+      <w:pPr>
+        <w:pStyle w:val="Heading2"/>
+      </w:pPr>
+      <w:r>
+        <w:t>Orphaned legacy code</w:t>
+      </w:r>
+    </w:p>
+    <w:p>
+      <w:r>
+        <w:rPr>
+          <w:b/>
+        </w:rPr>
+        <w:t>Files:</w:t>
+      </w:r>
+      <w:r>
+        <w:t xml:space="preserve"> </w:t>
+      </w:r>
+      <w:r>
+        <w:rPr>
+          <w:rFonts w:ascii="Consolas" w:hAnsi="Consolas"/>
+          <w:sz w:val="20"/>
+        </w:rPr>
+        <w:t>mobile/app/</w:t>
+      </w:r>
+      <w:r>
+        <w:t xml:space="preserve">, </w:t>
+      </w:r>
+      <w:r>
+        <w:rPr>
+          <w:rFonts w:ascii="Consolas" w:hAnsi="Consolas"/>
+          <w:sz w:val="20"/>
+        </w:rPr>
+        <w:t>mobile/components/</w:t>
+      </w:r>
+      <w:r>
+        <w:t xml:space="preserve">, </w:t>
+      </w:r>
+      <w:r>
+        <w:rPr>
+          <w:rFonts w:ascii="Consolas" w:hAnsi="Consolas"/>
+          <w:sz w:val="20"/>
+        </w:rPr>
+        <w:t>mobile/hooks/</w:t>
+      </w:r>
+      <w:r>
+        <w:t xml:space="preserve">, </w:t>
+      </w:r>
+      <w:r>
+        <w:rPr>
+          <w:rFonts w:ascii="Consolas" w:hAnsi="Consolas"/>
+          <w:sz w:val="20"/>
+        </w:rPr>
+        <w:t>mobile/constants/</w:t>
+      </w:r>
+      <w:r>
+        <w:t xml:space="preserve"> </w:t>
+      </w:r>
+      <w:r>
+        <w:rPr>
+          <w:b/>
+        </w:rPr>
+        <w:t>Status:</w:t>
+      </w:r>
+      <w:r>
+        <w:t xml:space="preserve"> Old HealthyGator/create-expo-app boilerplate, never deleted when Sai's app was merged in. Now fails to typecheck (23 errors) since </w:t>
+      </w:r>
+      <w:r>
+        <w:rPr>
+          <w:rFonts w:ascii="Consolas" w:hAnsi="Consolas"/>
+          <w:sz w:val="20"/>
+        </w:rPr>
+        <w:t>package.json</w:t>
+      </w:r>
+      <w:r>
+        <w:t xml:space="preserve"> dropped their dependencies (</w:t>
+      </w:r>
+      <w:r>
+        <w:rPr>
+          <w:rFonts w:ascii="Consolas" w:hAnsi="Consolas"/>
+          <w:sz w:val="20"/>
+        </w:rPr>
+        <w:t>expo-router</w:t>
+      </w:r>
+      <w:r>
+        <w:t xml:space="preserve">, </w:t>
+      </w:r>
+      <w:r>
+        <w:rPr>
+          <w:rFonts w:ascii="Consolas" w:hAnsi="Consolas"/>
+          <w:sz w:val="20"/>
+        </w:rPr>
+        <w:t>@react-navigation/native</w:t>
+      </w:r>
+      <w:r>
+        <w:t>, etc.). Delete — nothing references them.</w:t>
+      </w:r>
+    </w:p>
+    <w:p>
+      <w:pPr>
+        <w:pStyle w:val="Heading2"/>
+      </w:pPr>
+      <w:r>
+        <w:t>Expo Go cannot run this app; push notification native config gaps</w:t>
+      </w:r>
+    </w:p>
+    <w:p>
+      <w:r>
+        <w:rPr>
+          <w:b/>
+        </w:rPr>
+        <w:t>Status:</w:t>
+      </w:r>
+      <w:r>
+        <w:t xml:space="preserve"> </w:t>
+      </w:r>
+      <w:r>
+        <w:rPr>
+          <w:rFonts w:ascii="Consolas" w:hAnsi="Consolas"/>
+          <w:sz w:val="20"/>
+        </w:rPr>
+        <w:t>mobile/android/</w:t>
+      </w:r>
+      <w:r>
+        <w:t xml:space="preserve"> and </w:t>
+      </w:r>
+      <w:r>
+        <w:rPr>
+          <w:rFonts w:ascii="Consolas" w:hAnsi="Consolas"/>
+          <w:sz w:val="20"/>
+        </w:rPr>
+        <w:t>mobile/ios/</w:t>
+      </w:r>
+      <w:r>
+        <w:t xml:space="preserve"> native folders are committed (bare workflow, not gitignored/CNG) — Expo Go can't load a bare-workflow app regardless of anything else. Separately:</w:t>
       </w:r>
     </w:p>
     <w:p>
@@ -148,7 +605,24 @@
         <w:pStyle w:val="ListBullet"/>
       </w:pPr>
       <w:r>
-        <w:t>API endpoint URL and auth scheme (study-level API key → LABFRONT_API_KEY env var)</w:t>
+        <w:rPr>
+          <w:rFonts w:ascii="Consolas" w:hAnsi="Consolas"/>
+          <w:sz w:val="20"/>
+        </w:rPr>
+        <w:t>android/app/src/main/AndroidManifest.xml</w:t>
+      </w:r>
+      <w:r>
+        <w:t xml:space="preserve"> has no </w:t>
+      </w:r>
+      <w:r>
+        <w:rPr>
+          <w:rFonts w:ascii="Consolas" w:hAnsi="Consolas"/>
+          <w:sz w:val="20"/>
+        </w:rPr>
+        <w:t>POST_NOTIFICATIONS</w:t>
+      </w:r>
+      <w:r>
+        <w:t xml:space="preserve"> permission — required on Android 13+ for any notification to post at all.</w:t>
       </w:r>
     </w:p>
     <w:p>
@@ -156,7 +630,24 @@
         <w:pStyle w:val="ListBullet"/>
       </w:pPr>
       <w:r>
-        <w:t>Endpoint for per-participant HR data (15-sec resolution)</w:t>
+        <w:rPr>
+          <w:rFonts w:ascii="Consolas" w:hAnsi="Consolas"/>
+          <w:sz w:val="20"/>
+        </w:rPr>
+        <w:t>ios/REACT/Info.plist</w:t>
+      </w:r>
+      <w:r>
+        <w:t xml:space="preserve"> has no </w:t>
+      </w:r>
+      <w:r>
+        <w:rPr>
+          <w:rFonts w:ascii="Consolas" w:hAnsi="Consolas"/>
+          <w:sz w:val="20"/>
+        </w:rPr>
+        <w:t>UIBackgroundModes: remote-notification</w:t>
+      </w:r>
+      <w:r>
+        <w:t xml:space="preserve"> — needed for the silent/background pushes this project's architecture depends on.</w:t>
       </w:r>
     </w:p>
     <w:p>
@@ -164,7 +655,494 @@
         <w:pStyle w:val="ListBullet"/>
       </w:pPr>
       <w:r>
-        <w:t>Endpoint for per-participant stress data (3-min epochs)</w:t>
+        <w:rPr>
+          <w:rFonts w:ascii="Consolas" w:hAnsi="Consolas"/>
+          <w:sz w:val="20"/>
+        </w:rPr>
+        <w:t>expo-doctor</w:t>
+      </w:r>
+      <w:r>
+        <w:t xml:space="preserve"> confirms </w:t>
+      </w:r>
+      <w:r>
+        <w:rPr>
+          <w:rFonts w:ascii="Consolas" w:hAnsi="Consolas"/>
+          <w:sz w:val="20"/>
+        </w:rPr>
+        <w:t>app.json</w:t>
+      </w:r>
+      <w:r>
+        <w:t xml:space="preserve">'s </w:t>
+      </w:r>
+      <w:r>
+        <w:rPr>
+          <w:rFonts w:ascii="Consolas" w:hAnsi="Consolas"/>
+          <w:sz w:val="20"/>
+        </w:rPr>
+        <w:t>ios</w:t>
+      </w:r>
+      <w:r>
+        <w:t>/</w:t>
+      </w:r>
+      <w:r>
+        <w:rPr>
+          <w:rFonts w:ascii="Consolas" w:hAnsi="Consolas"/>
+          <w:sz w:val="20"/>
+        </w:rPr>
+        <w:t>android</w:t>
+      </w:r>
+      <w:r>
+        <w:t>/</w:t>
+      </w:r>
+      <w:r>
+        <w:rPr>
+          <w:rFonts w:ascii="Consolas" w:hAnsi="Consolas"/>
+          <w:sz w:val="20"/>
+        </w:rPr>
+        <w:t>icon</w:t>
+      </w:r>
+      <w:r>
+        <w:t>/</w:t>
+      </w:r>
+      <w:r>
+        <w:rPr>
+          <w:rFonts w:ascii="Consolas" w:hAnsi="Consolas"/>
+          <w:sz w:val="20"/>
+        </w:rPr>
+        <w:t>orientation</w:t>
+      </w:r>
+      <w:r>
+        <w:t xml:space="preserve"> fields are now dead (ignored, since native folders exist and won't re-sync without </w:t>
+      </w:r>
+      <w:r>
+        <w:rPr>
+          <w:rFonts w:ascii="Consolas" w:hAnsi="Consolas"/>
+          <w:sz w:val="20"/>
+        </w:rPr>
+        <w:t>expo prebuild</w:t>
+      </w:r>
+      <w:r>
+        <w:t>).</w:t>
+      </w:r>
+    </w:p>
+    <w:p>
+      <w:pPr>
+        <w:pStyle w:val="Heading2"/>
+      </w:pPr>
+      <w:r>
+        <w:t>No enrollment / wearable-registration UI</w:t>
+      </w:r>
+    </w:p>
+    <w:p>
+      <w:r>
+        <w:t xml:space="preserve">Nothing in Login/Register/Compose calls </w:t>
+      </w:r>
+      <w:r>
+        <w:rPr>
+          <w:rFonts w:ascii="Consolas" w:hAnsi="Consolas"/>
+          <w:sz w:val="20"/>
+        </w:rPr>
+        <w:t>POST /wearable/</w:t>
+      </w:r>
+      <w:r>
+        <w:t xml:space="preserve"> or sets </w:t>
+      </w:r>
+      <w:r>
+        <w:rPr>
+          <w:rFonts w:ascii="Consolas" w:hAnsi="Consolas"/>
+          <w:sz w:val="20"/>
+        </w:rPr>
+        <w:t>is_enrolled=True</w:t>
+      </w:r>
+      <w:r>
+        <w:t>. Confirm with Sai whether this was planned as a separate flow.</w:t>
+      </w:r>
+    </w:p>
+    <w:p>
+      <w:pPr>
+        <w:pStyle w:val="Heading2"/>
+      </w:pPr>
+      <w:r>
+        <w:t>`BASE_URL` hardcoded to `'prod'`</w:t>
+      </w:r>
+    </w:p>
+    <w:p>
+      <w:r>
+        <w:rPr>
+          <w:b/>
+        </w:rPr>
+        <w:t>File:</w:t>
+      </w:r>
+      <w:r>
+        <w:t xml:space="preserve"> </w:t>
+      </w:r>
+      <w:r>
+        <w:rPr>
+          <w:rFonts w:ascii="Consolas" w:hAnsi="Consolas"/>
+          <w:sz w:val="20"/>
+        </w:rPr>
+        <w:t>mobile/src/api/config.ts</w:t>
+      </w:r>
+      <w:r>
+        <w:t xml:space="preserve"> — a </w:t>
+      </w:r>
+      <w:r>
+        <w:rPr>
+          <w:rFonts w:ascii="Consolas" w:hAnsi="Consolas"/>
+          <w:sz w:val="20"/>
+        </w:rPr>
+        <w:t>dev</w:t>
+      </w:r>
+      <w:r>
+        <w:t>/</w:t>
+      </w:r>
+      <w:r>
+        <w:rPr>
+          <w:rFonts w:ascii="Consolas" w:hAnsi="Consolas"/>
+          <w:sz w:val="20"/>
+        </w:rPr>
+        <w:t>prod</w:t>
+      </w:r>
+      <w:r>
+        <w:t xml:space="preserve"> switch already exists, just needs flipping.</w:t>
+      </w:r>
+    </w:p>
+    <w:p>
+      <w:pPr>
+        <w:pStyle w:val="Heading2"/>
+      </w:pPr>
+      <w:r>
+        <w:t>`backend/requirements_mac.txt` is broken</w:t>
+      </w:r>
+    </w:p>
+    <w:p>
+      <w:r>
+        <w:rPr>
+          <w:b/>
+        </w:rPr>
+        <w:t>Status:</w:t>
+      </w:r>
+      <w:r>
+        <w:t xml:space="preserve"> Missing </w:t>
+      </w:r>
+      <w:r>
+        <w:rPr>
+          <w:rFonts w:ascii="Consolas" w:hAnsi="Consolas"/>
+          <w:sz w:val="20"/>
+        </w:rPr>
+        <w:t>sentry_sdk</w:t>
+      </w:r>
+      <w:r>
+        <w:t xml:space="preserve">, </w:t>
+      </w:r>
+      <w:r>
+        <w:rPr>
+          <w:rFonts w:ascii="Consolas" w:hAnsi="Consolas"/>
+          <w:sz w:val="20"/>
+        </w:rPr>
+        <w:t>django-redis</w:t>
+      </w:r>
+      <w:r>
+        <w:t xml:space="preserve">, </w:t>
+      </w:r>
+      <w:r>
+        <w:rPr>
+          <w:rFonts w:ascii="Consolas" w:hAnsi="Consolas"/>
+          <w:sz w:val="20"/>
+        </w:rPr>
+        <w:t>djangorestframework_simplejwt</w:t>
+      </w:r>
+      <w:r>
+        <w:t xml:space="preserve">, </w:t>
+      </w:r>
+      <w:r>
+        <w:rPr>
+          <w:rFonts w:ascii="Consolas" w:hAnsi="Consolas"/>
+          <w:sz w:val="20"/>
+        </w:rPr>
+        <w:t>argon2-cffi</w:t>
+      </w:r>
+      <w:r>
+        <w:t xml:space="preserve">, and </w:t>
+      </w:r>
+      <w:r>
+        <w:rPr>
+          <w:rFonts w:ascii="Consolas" w:hAnsi="Consolas"/>
+          <w:sz w:val="20"/>
+        </w:rPr>
+        <w:t>psycopg</w:t>
+      </w:r>
+      <w:r>
+        <w:t xml:space="preserve">. A fresh Mac clone can't run </w:t>
+      </w:r>
+      <w:r>
+        <w:rPr>
+          <w:rFonts w:ascii="Consolas" w:hAnsi="Consolas"/>
+          <w:sz w:val="20"/>
+        </w:rPr>
+        <w:t>manage.py</w:t>
+      </w:r>
+      <w:r>
+        <w:t xml:space="preserve"> at all. ~10 minute fix — diff against </w:t>
+      </w:r>
+      <w:r>
+        <w:rPr>
+          <w:rFonts w:ascii="Consolas" w:hAnsi="Consolas"/>
+          <w:sz w:val="20"/>
+        </w:rPr>
+        <w:t>requirements.txt</w:t>
+      </w:r>
+      <w:r>
+        <w:t>.</w:t>
+      </w:r>
+    </w:p>
+    <w:p>
+      <w:pPr>
+        <w:pStyle w:val="Heading2"/>
+      </w:pPr>
+      <w:r>
+        <w:t>No missing-check-in / non-response detection</w:t>
+      </w:r>
+    </w:p>
+    <w:p>
+      <w:r>
+        <w:rPr>
+          <w:b/>
+        </w:rPr>
+        <w:t>File:</w:t>
+      </w:r>
+      <w:r>
+        <w:t xml:space="preserve"> </w:t>
+      </w:r>
+      <w:r>
+        <w:rPr>
+          <w:rFonts w:ascii="Consolas" w:hAnsi="Consolas"/>
+          <w:sz w:val="20"/>
+        </w:rPr>
+        <w:t>backend/app/tasks.py</w:t>
+      </w:r>
+      <w:r>
+        <w:t xml:space="preserve"> → </w:t>
+      </w:r>
+      <w:r>
+        <w:rPr>
+          <w:rFonts w:ascii="Consolas" w:hAnsi="Consolas"/>
+          <w:sz w:val="20"/>
+        </w:rPr>
+        <w:t>_evaluate_user()</w:t>
+      </w:r>
+      <w:r>
+        <w:t xml:space="preserve">, </w:t>
+      </w:r>
+      <w:r>
+        <w:rPr>
+          <w:rFonts w:ascii="Consolas" w:hAnsi="Consolas"/>
+          <w:sz w:val="20"/>
+        </w:rPr>
+        <w:t>backend/app/models.py</w:t>
+      </w:r>
+      <w:r>
+        <w:t xml:space="preserve"> → </w:t>
+      </w:r>
+      <w:r>
+        <w:rPr>
+          <w:rFonts w:ascii="Consolas" w:hAnsi="Consolas"/>
+          <w:sz w:val="20"/>
+        </w:rPr>
+        <w:t>EMA.status</w:t>
+      </w:r>
+      <w:r>
+        <w:t xml:space="preserve"> </w:t>
+      </w:r>
+      <w:r>
+        <w:rPr>
+          <w:rFonts w:ascii="Consolas" w:hAnsi="Consolas"/>
+          <w:sz w:val="20"/>
+        </w:rPr>
+        <w:t>EMA.status='expired'</w:t>
+      </w:r>
+      <w:r>
+        <w:t xml:space="preserve"> is declared but never assigned anywhere outside test fixtures.</w:t>
+      </w:r>
+    </w:p>
+    <w:p>
+      <w:pPr>
+        <w:pStyle w:val="Heading2"/>
+      </w:pPr>
+      <w:r>
+        <w:t>`trigger_signal` field always written `None`</w:t>
+      </w:r>
+    </w:p>
+    <w:p>
+      <w:r>
+        <w:rPr>
+          <w:b/>
+        </w:rPr>
+        <w:t>File:</w:t>
+      </w:r>
+      <w:r>
+        <w:t xml:space="preserve"> </w:t>
+      </w:r>
+      <w:r>
+        <w:rPr>
+          <w:rFonts w:ascii="Consolas" w:hAnsi="Consolas"/>
+          <w:sz w:val="20"/>
+        </w:rPr>
+        <w:t>backend/app/tasks.py:105</w:t>
+      </w:r>
+      <w:r>
+        <w:t xml:space="preserve">. Declared on </w:t>
+      </w:r>
+      <w:r>
+        <w:rPr>
+          <w:rFonts w:ascii="Consolas" w:hAnsi="Consolas"/>
+          <w:sz w:val="20"/>
+        </w:rPr>
+        <w:t>JITAILog</w:t>
+      </w:r>
+      <w:r>
+        <w:t>, never populated.</w:t>
+      </w:r>
+    </w:p>
+    <w:p>
+      <w:pPr>
+        <w:pStyle w:val="Heading2"/>
+      </w:pPr>
+      <w:r>
+        <w:t>`celery.py` disables TLS certificate verification for `rediss://`</w:t>
+      </w:r>
+    </w:p>
+    <w:p>
+      <w:r>
+        <w:rPr>
+          <w:b/>
+        </w:rPr>
+        <w:t>File:</w:t>
+      </w:r>
+      <w:r>
+        <w:t xml:space="preserve"> </w:t>
+      </w:r>
+      <w:r>
+        <w:rPr>
+          <w:rFonts w:ascii="Consolas" w:hAnsi="Consolas"/>
+          <w:sz w:val="20"/>
+        </w:rPr>
+        <w:t>backend/project/celery.py</w:t>
+      </w:r>
+      <w:r>
+        <w:t xml:space="preserve"> — </w:t>
+      </w:r>
+      <w:r>
+        <w:rPr>
+          <w:rFonts w:ascii="Consolas" w:hAnsi="Consolas"/>
+          <w:sz w:val="20"/>
+        </w:rPr>
+        <w:t>ssl_cert_reqs: ssl.CERT_NONE</w:t>
+      </w:r>
+      <w:r>
+        <w:t>. Flag for a security pass.</w:t>
+      </w:r>
+    </w:p>
+    <w:p>
+      <w:pPr>
+        <w:pStyle w:val="Heading2"/>
+      </w:pPr>
+      <w:r>
+        <w:t>`.env` doesn't document all required/optional variables</w:t>
+      </w:r>
+    </w:p>
+    <w:p>
+      <w:r>
+        <w:rPr>
+          <w:rFonts w:ascii="Consolas" w:hAnsi="Consolas"/>
+          <w:sz w:val="20"/>
+        </w:rPr>
+        <w:t>DASHBOARD_API_KEY</w:t>
+      </w:r>
+      <w:r>
+        <w:t xml:space="preserve"> and </w:t>
+      </w:r>
+      <w:r>
+        <w:rPr>
+          <w:rFonts w:ascii="Consolas" w:hAnsi="Consolas"/>
+          <w:sz w:val="20"/>
+        </w:rPr>
+        <w:t>JITAI_RANDOMIZATION_PROBABILITY</w:t>
+      </w:r>
+      <w:r>
+        <w:t xml:space="preserve"> both have code-level defaults but aren't documented anywhere.</w:t>
+      </w:r>
+    </w:p>
+    <w:p/>
+    <w:p>
+      <w:pPr>
+        <w:pStyle w:val="Heading1"/>
+      </w:pPr>
+      <w:r>
+        <w:t>Blocked on External Deliverable</w:t>
+      </w:r>
+    </w:p>
+    <w:p>
+      <w:pPr>
+        <w:pStyle w:val="Heading2"/>
+      </w:pPr>
+      <w:r>
+        <w:t>Labfront API Integration</w:t>
+      </w:r>
+    </w:p>
+    <w:p>
+      <w:r>
+        <w:rPr>
+          <w:b/>
+        </w:rPr>
+        <w:t>File:</w:t>
+      </w:r>
+      <w:r>
+        <w:t xml:space="preserve"> </w:t>
+      </w:r>
+      <w:r>
+        <w:rPr>
+          <w:rFonts w:ascii="Consolas" w:hAnsi="Consolas"/>
+          <w:sz w:val="20"/>
+        </w:rPr>
+        <w:t>app/tasks.py</w:t>
+      </w:r>
+      <w:r>
+        <w:t xml:space="preserve"> → </w:t>
+      </w:r>
+      <w:r>
+        <w:rPr>
+          <w:rFonts w:ascii="Consolas" w:hAnsi="Consolas"/>
+          <w:sz w:val="20"/>
+        </w:rPr>
+        <w:t>ingest_wearable_data()</w:t>
+      </w:r>
+      <w:r>
+        <w:t xml:space="preserve"> </w:t>
+      </w:r>
+      <w:r>
+        <w:rPr>
+          <w:b/>
+        </w:rPr>
+        <w:t>Status:</w:t>
+      </w:r>
+      <w:r>
+        <w:t xml:space="preserve"> Stub — logs "not yet implemented" </w:t>
+      </w:r>
+      <w:r>
+        <w:rPr>
+          <w:b/>
+        </w:rPr>
+        <w:t>Blocked by:</w:t>
+      </w:r>
+      <w:r>
+        <w:t xml:space="preserve"> Labfront API access and documentation (paid add-on — pending contract confirmation with Prof. Chang) </w:t>
+      </w:r>
+      <w:r>
+        <w:rPr>
+          <w:b/>
+        </w:rPr>
+        <w:t>What's needed:</w:t>
       </w:r>
     </w:p>
     <w:p>
@@ -172,12 +1150,17 @@
         <w:pStyle w:val="ListBullet"/>
       </w:pPr>
       <w:r>
-        <w:t>Rate limit and pagination details</w:t>
-      </w:r>
-    </w:p>
-    <w:p>
-      <w:r>
-        <w:t>When unblocked, replace the stub body in ingest_wearable_data() with:</w:t>
+        <w:t xml:space="preserve">Labfront API endpoint URL and auth scheme (study-level API key → </w:t>
+      </w:r>
+      <w:r>
+        <w:rPr>
+          <w:rFonts w:ascii="Consolas" w:hAnsi="Consolas"/>
+          <w:sz w:val="20"/>
+        </w:rPr>
+        <w:t>LABFRONT_API_KEY</w:t>
+      </w:r>
+      <w:r>
+        <w:t xml:space="preserve"> env var)</w:t>
       </w:r>
     </w:p>
     <w:p>
@@ -185,7 +1168,7 @@
         <w:pStyle w:val="ListBullet"/>
       </w:pPr>
       <w:r>
-        <w:t>Iterate enrolled participants (WearableDevice.objects.filter(is_active=True))</w:t>
+        <w:t>Endpoint for per-participant HR data (15-sec resolution)</w:t>
       </w:r>
     </w:p>
     <w:p>
@@ -193,7 +1176,7 @@
         <w:pStyle w:val="ListBullet"/>
       </w:pPr>
       <w:r>
-        <w:t>Call Labfront API with labfront_participant_id</w:t>
+        <w:t>Endpoint for per-participant stress data (3-min epochs)</w:t>
       </w:r>
     </w:p>
     <w:p>
@@ -201,7 +1184,138 @@
         <w:pStyle w:val="ListBullet"/>
       </w:pPr>
       <w:r>
-        <w:t>Write HeartRateSample and StressSample rows via Django ORM</w:t>
+        <w:t>Rate limit and pagination details</w:t>
+      </w:r>
+    </w:p>
+    <w:p>
+      <w:r>
+        <w:rPr>
+          <w:b/>
+        </w:rPr>
+        <w:t>When unblocked:</w:t>
+      </w:r>
+      <w:r>
+        <w:t xml:space="preserve"> Replace the stub body in </w:t>
+      </w:r>
+      <w:r>
+        <w:rPr>
+          <w:rFonts w:ascii="Consolas" w:hAnsi="Consolas"/>
+          <w:sz w:val="20"/>
+        </w:rPr>
+        <w:t>ingest_wearable_data()</w:t>
+      </w:r>
+      <w:r>
+        <w:t xml:space="preserve"> with:</w:t>
+      </w:r>
+    </w:p>
+    <w:p>
+      <w:pPr>
+        <w:pStyle w:val="ListNumber"/>
+      </w:pPr>
+      <w:r>
+        <w:t>Iterate enrolled participants (</w:t>
+      </w:r>
+      <w:r>
+        <w:rPr>
+          <w:rFonts w:ascii="Consolas" w:hAnsi="Consolas"/>
+          <w:sz w:val="20"/>
+        </w:rPr>
+        <w:t>WearableDevice.objects.filter(is_active=True)</w:t>
+      </w:r>
+      <w:r>
+        <w:t>)</w:t>
+      </w:r>
+    </w:p>
+    <w:p>
+      <w:pPr>
+        <w:pStyle w:val="ListNumber"/>
+      </w:pPr>
+      <w:r>
+        <w:t xml:space="preserve">Call Labfront API with </w:t>
+      </w:r>
+      <w:r>
+        <w:rPr>
+          <w:rFonts w:ascii="Consolas" w:hAnsi="Consolas"/>
+          <w:sz w:val="20"/>
+        </w:rPr>
+        <w:t>labfront_participant_id</w:t>
+      </w:r>
+    </w:p>
+    <w:p>
+      <w:pPr>
+        <w:pStyle w:val="ListNumber"/>
+      </w:pPr>
+      <w:r>
+        <w:t xml:space="preserve">Write </w:t>
+      </w:r>
+      <w:r>
+        <w:rPr>
+          <w:rFonts w:ascii="Consolas" w:hAnsi="Consolas"/>
+          <w:sz w:val="20"/>
+        </w:rPr>
+        <w:t>HeartRateSample</w:t>
+      </w:r>
+      <w:r>
+        <w:t xml:space="preserve"> and </w:t>
+      </w:r>
+      <w:r>
+        <w:rPr>
+          <w:rFonts w:ascii="Consolas" w:hAnsi="Consolas"/>
+          <w:sz w:val="20"/>
+        </w:rPr>
+        <w:t>StressSample</w:t>
+      </w:r>
+      <w:r>
+        <w:t xml:space="preserve"> rows via Django ORM</w:t>
+      </w:r>
+    </w:p>
+    <w:p>
+      <w:pPr>
+        <w:pStyle w:val="ListNumber"/>
+      </w:pPr>
+      <w:r>
+        <w:t xml:space="preserve">Update </w:t>
+      </w:r>
+      <w:r>
+        <w:rPr>
+          <w:rFonts w:ascii="Consolas" w:hAnsi="Consolas"/>
+          <w:sz w:val="20"/>
+        </w:rPr>
+        <w:t>WearableDevice.last_synced_at</w:t>
+      </w:r>
+    </w:p>
+    <w:p/>
+    <w:p>
+      <w:pPr>
+        <w:pStyle w:val="Heading1"/>
+      </w:pPr>
+      <w:r>
+        <w:t>Blocked on PI Sign-Off</w:t>
+      </w:r>
+    </w:p>
+    <w:p>
+      <w:pPr>
+        <w:pStyle w:val="Heading2"/>
+      </w:pPr>
+      <w:r>
+        <w:t>Researcher Dashboard (Django Admin Extension)</w:t>
+      </w:r>
+    </w:p>
+    <w:p>
+      <w:r>
+        <w:rPr>
+          <w:b/>
+        </w:rPr>
+        <w:t>Status:</w:t>
+      </w:r>
+      <w:r>
+        <w:t xml:space="preserve"> Deferred — waiting on PI availability </w:t>
+      </w:r>
+      <w:r>
+        <w:rPr>
+          <w:b/>
+        </w:rPr>
+        <w:t>What's needed from Prof. Chang before building:</w:t>
       </w:r>
     </w:p>
     <w:p>
@@ -209,226 +1323,7 @@
         <w:pStyle w:val="ListBullet"/>
       </w:pPr>
       <w:r>
-        <w:t>Update WearableDevice.last_synced_at</w:t>
-      </w:r>
-    </w:p>
-    <w:p>
-      <w:pPr>
-        <w:pStyle w:val="Heading1"/>
-      </w:pPr>
-      <w:r>
-        <w:t>2  Blocked on PI Sign-Off</w:t>
-      </w:r>
-    </w:p>
-    <w:p>
-      <w:pPr>
-        <w:pStyle w:val="Heading2"/>
-      </w:pPr>
-      <w:r>
-        <w:t>2.1  JITAI Trigger Thresholds</w:t>
-      </w:r>
-    </w:p>
-    <w:tbl>
-      <w:tblPr>
-        <w:tblStyle w:val="TableGrid"/>
-        <w:tblW w:type="auto" w:w="0"/>
-        <w:tblLook w:firstColumn="1" w:firstRow="1" w:lastColumn="0" w:lastRow="0" w:noHBand="0" w:noVBand="1" w:val="04A0"/>
-      </w:tblPr>
-      <w:tblGrid>
-        <w:gridCol w:w="4320"/>
-        <w:gridCol w:w="4320"/>
-      </w:tblGrid>
-      <w:tr>
-        <w:tc>
-          <w:tcPr>
-            <w:tcW w:type="dxa" w:w="4320"/>
-          </w:tcPr>
-          <w:p>
-            <w:r>
-              <w:rPr>
-                <w:b/>
-              </w:rPr>
-              <w:t>Field</w:t>
-            </w:r>
-          </w:p>
-        </w:tc>
-        <w:tc>
-          <w:tcPr>
-            <w:tcW w:type="dxa" w:w="4320"/>
-          </w:tcPr>
-          <w:p>
-            <w:r>
-              <w:rPr>
-                <w:b/>
-              </w:rPr>
-              <w:t>Detail</w:t>
-            </w:r>
-          </w:p>
-        </w:tc>
-      </w:tr>
-      <w:tr>
-        <w:tc>
-          <w:tcPr>
-            <w:tcW w:type="dxa" w:w="4320"/>
-          </w:tcPr>
-          <w:p>
-            <w:r>
-              <w:t>File</w:t>
-            </w:r>
-          </w:p>
-        </w:tc>
-        <w:tc>
-          <w:tcPr>
-            <w:tcW w:type="dxa" w:w="4320"/>
-          </w:tcPr>
-          <w:p>
-            <w:r>
-              <w:t>decision_engine/decision_engine.py → apply_decision_rules()</w:t>
-            </w:r>
-          </w:p>
-        </w:tc>
-      </w:tr>
-      <w:tr>
-        <w:tc>
-          <w:tcPr>
-            <w:tcW w:type="dxa" w:w="4320"/>
-          </w:tcPr>
-          <w:p>
-            <w:r>
-              <w:t>Status</w:t>
-            </w:r>
-          </w:p>
-        </w:tc>
-        <w:tc>
-          <w:tcPr>
-            <w:tcW w:type="dxa" w:w="4320"/>
-          </w:tcPr>
-          <w:p>
-            <w:r>
-              <w:t>Defaults are set: threshold_quantile=0.80, cooldown_minutes=60, max_prompts_per_day=4</w:t>
-            </w:r>
-          </w:p>
-        </w:tc>
-      </w:tr>
-      <w:tr>
-        <w:tc>
-          <w:tcPr>
-            <w:tcW w:type="dxa" w:w="4320"/>
-          </w:tcPr>
-          <w:p>
-            <w:r>
-              <w:t>Action needed</w:t>
-            </w:r>
-          </w:p>
-        </w:tc>
-        <w:tc>
-          <w:tcPr>
-            <w:tcW w:type="dxa" w:w="4320"/>
-          </w:tcPr>
-          <w:p>
-            <w:r>
-              <w:t>Prof. Chang to confirm or adjust these values before study launch</w:t>
-            </w:r>
-          </w:p>
-        </w:tc>
-      </w:tr>
-      <w:tr>
-        <w:tc>
-          <w:tcPr>
-            <w:tcW w:type="dxa" w:w="4320"/>
-          </w:tcPr>
-          <w:p>
-            <w:r>
-              <w:t>Reference</w:t>
-            </w:r>
-          </w:p>
-        </w:tc>
-        <w:tc>
-          <w:tcPr>
-            <w:tcW w:type="dxa" w:w="4320"/>
-          </w:tcPr>
-          <w:p>
-            <w:r>
-              <w:t>Architecture doc, Section 5 (Key Constraints)</w:t>
-            </w:r>
-          </w:p>
-        </w:tc>
-      </w:tr>
-    </w:tbl>
-    <w:p/>
-    <w:p>
-      <w:pPr>
-        <w:pStyle w:val="Heading2"/>
-      </w:pPr>
-      <w:r>
-        <w:t>2.2  Researcher Dashboard (Django Admin Extension)</w:t>
-      </w:r>
-    </w:p>
-    <w:tbl>
-      <w:tblPr>
-        <w:tblStyle w:val="TableGrid"/>
-        <w:tblW w:type="auto" w:w="0"/>
-        <w:tblLook w:firstColumn="1" w:firstRow="1" w:lastColumn="0" w:lastRow="0" w:noHBand="0" w:noVBand="1" w:val="04A0"/>
-      </w:tblPr>
-      <w:tblGrid>
-        <w:gridCol w:w="4320"/>
-        <w:gridCol w:w="4320"/>
-      </w:tblGrid>
-      <w:tr>
-        <w:tc>
-          <w:tcPr>
-            <w:tcW w:type="dxa" w:w="4320"/>
-          </w:tcPr>
-          <w:p>
-            <w:r>
-              <w:rPr>
-                <w:b/>
-              </w:rPr>
-              <w:t>Field</w:t>
-            </w:r>
-          </w:p>
-        </w:tc>
-        <w:tc>
-          <w:tcPr>
-            <w:tcW w:type="dxa" w:w="4320"/>
-          </w:tcPr>
-          <w:p>
-            <w:r>
-              <w:rPr>
-                <w:b/>
-              </w:rPr>
-              <w:t>Detail</w:t>
-            </w:r>
-          </w:p>
-        </w:tc>
-      </w:tr>
-      <w:tr>
-        <w:tc>
-          <w:tcPr>
-            <w:tcW w:type="dxa" w:w="4320"/>
-          </w:tcPr>
-          <w:p>
-            <w:r>
-              <w:t>Status</w:t>
-            </w:r>
-          </w:p>
-        </w:tc>
-        <w:tc>
-          <w:tcPr>
-            <w:tcW w:type="dxa" w:w="4320"/>
-          </w:tcPr>
-          <w:p>
-            <w:r>
-              <w:t>Deferred — waiting on PI availability</w:t>
-            </w:r>
-          </w:p>
-        </w:tc>
-      </w:tr>
-    </w:tbl>
-    <w:p/>
-    <w:p>
-      <w:r>
-        <w:t>What is needed from Prof. Chang before building:</w:t>
+        <w:t>RA access scope: which fields RAs may see under the IRB protocol (EMA Likert scores? Push tokens? Enrollment timestamps?)</w:t>
       </w:r>
     </w:p>
     <w:p>
@@ -436,7 +1331,17 @@
         <w:pStyle w:val="ListBullet"/>
       </w:pPr>
       <w:r>
-        <w:t>RA access scope: which fields RAs may see under the IRB protocol (EMA Likert scores? Push tokens? Enrollment timestamps?)</w:t>
+        <w:t xml:space="preserve">Whether </w:t>
+      </w:r>
+      <w:r>
+        <w:rPr>
+          <w:rFonts w:ascii="Consolas" w:hAnsi="Consolas"/>
+          <w:sz w:val="20"/>
+        </w:rPr>
+        <w:t>researcher_ra</w:t>
+      </w:r>
+      <w:r>
+        <w:t xml:space="preserve"> group gets read-only access to EMA + JITAILog only, or also HeartRateSample/StressSample</w:t>
       </w:r>
     </w:p>
     <w:p>
@@ -444,7 +1349,28 @@
         <w:pStyle w:val="ListBullet"/>
       </w:pPr>
       <w:r>
-        <w:t>Whether researcher_ra group gets read-only access to EMA + JITAILog only, or also HeartRateSample/StressSample</w:t>
+        <w:t>CSV export requirements: which fields per table, any PII redaction needed for RA exports</w:t>
+      </w:r>
+    </w:p>
+    <w:p>
+      <w:r>
+        <w:rPr>
+          <w:b/>
+        </w:rPr>
+        <w:t>When unblocked:</w:t>
+      </w:r>
+      <w:r>
+        <w:t xml:space="preserve"> Extend </w:t>
+      </w:r>
+      <w:r>
+        <w:rPr>
+          <w:rFonts w:ascii="Consolas" w:hAnsi="Consolas"/>
+          <w:sz w:val="20"/>
+        </w:rPr>
+        <w:t>app/admin.py</w:t>
+      </w:r>
+      <w:r>
+        <w:t xml:space="preserve"> with:</w:t>
       </w:r>
     </w:p>
     <w:p>
@@ -452,12 +1378,27 @@
         <w:pStyle w:val="ListBullet"/>
       </w:pPr>
       <w:r>
-        <w:t>CSV export requirements: which fields per table, any PII redaction needed for RA exports</w:t>
-      </w:r>
-    </w:p>
-    <w:p>
-      <w:r>
-        <w:t>When unblocked, extend app/admin.py with:</w:t>
+        <w:t>Django permission groups (</w:t>
+      </w:r>
+      <w:r>
+        <w:rPr>
+          <w:rFonts w:ascii="Consolas" w:hAnsi="Consolas"/>
+          <w:sz w:val="20"/>
+        </w:rPr>
+        <w:t>researcher_pi</w:t>
+      </w:r>
+      <w:r>
+        <w:t xml:space="preserve">, </w:t>
+      </w:r>
+      <w:r>
+        <w:rPr>
+          <w:rFonts w:ascii="Consolas" w:hAnsi="Consolas"/>
+          <w:sz w:val="20"/>
+        </w:rPr>
+        <w:t>researcher_ra</w:t>
+      </w:r>
+      <w:r>
+        <w:t>)</w:t>
       </w:r>
     </w:p>
     <w:p>
@@ -465,7 +1406,7 @@
         <w:pStyle w:val="ListBullet"/>
       </w:pPr>
       <w:r>
-        <w:t>Django permission groups (researcher_pi, researcher_ra)</w:t>
+        <w:t>CSV export actions on all ModelAdmin views</w:t>
       </w:r>
     </w:p>
     <w:p>
@@ -473,7 +1414,17 @@
         <w:pStyle w:val="ListBullet"/>
       </w:pPr>
       <w:r>
-        <w:t>CSV export actions on all ModelAdmin views</w:t>
+        <w:t xml:space="preserve">Computed columns on </w:t>
+      </w:r>
+      <w:r>
+        <w:rPr>
+          <w:rFonts w:ascii="Consolas" w:hAnsi="Consolas"/>
+          <w:sz w:val="20"/>
+        </w:rPr>
+        <w:t>UserAdmin</w:t>
+      </w:r>
+      <w:r>
+        <w:t xml:space="preserve"> (last EMA, last sync, JITAI count this week)</w:t>
       </w:r>
     </w:p>
     <w:p>
@@ -481,327 +1432,21 @@
         <w:pStyle w:val="ListBullet"/>
       </w:pPr>
       <w:r>
-        <w:t>Computed columns on UserAdmin (last EMA, last sync, JITAI count this week)</w:t>
+        <w:t>EMA completion rate and Likert trend views</w:t>
       </w:r>
     </w:p>
-    <w:p>
-      <w:pPr>
-        <w:pStyle w:val="ListBullet"/>
-      </w:pPr>
-      <w:r>
-        <w:t>EMA completion rate and Likert trend views</w:t>
-      </w:r>
-    </w:p>
+    <w:p/>
     <w:p>
       <w:pPr>
         <w:pStyle w:val="Heading1"/>
       </w:pPr>
       <w:r>
-        <w:t>3  Blocked on Prompt Library Design</w:t>
-      </w:r>
-    </w:p>
-    <w:p>
-      <w:pPr>
-        <w:pStyle w:val="Heading2"/>
-      </w:pPr>
-      <w:r>
-        <w:t>3.1  Multi-Prompt Support</w:t>
+        <w:t>Open Research / Contract Questions</w:t>
       </w:r>
     </w:p>
     <w:tbl>
       <w:tblPr>
-        <w:tblStyle w:val="TableGrid"/>
-        <w:tblW w:type="auto" w:w="0"/>
-        <w:tblLook w:firstColumn="1" w:firstRow="1" w:lastColumn="0" w:lastRow="0" w:noHBand="0" w:noVBand="1" w:val="04A0"/>
-      </w:tblPr>
-      <w:tblGrid>
-        <w:gridCol w:w="4320"/>
-        <w:gridCol w:w="4320"/>
-      </w:tblGrid>
-      <w:tr>
-        <w:tc>
-          <w:tcPr>
-            <w:tcW w:type="dxa" w:w="4320"/>
-          </w:tcPr>
-          <w:p>
-            <w:r>
-              <w:rPr>
-                <w:b/>
-              </w:rPr>
-              <w:t>Field</w:t>
-            </w:r>
-          </w:p>
-        </w:tc>
-        <w:tc>
-          <w:tcPr>
-            <w:tcW w:type="dxa" w:w="4320"/>
-          </w:tcPr>
-          <w:p>
-            <w:r>
-              <w:rPr>
-                <w:b/>
-              </w:rPr>
-              <w:t>Detail</w:t>
-            </w:r>
-          </w:p>
-        </w:tc>
-      </w:tr>
-      <w:tr>
-        <w:tc>
-          <w:tcPr>
-            <w:tcW w:type="dxa" w:w="4320"/>
-          </w:tcPr>
-          <w:p>
-            <w:r>
-              <w:t>File</w:t>
-            </w:r>
-          </w:p>
-        </w:tc>
-        <w:tc>
-          <w:tcPr>
-            <w:tcW w:type="dxa" w:w="4320"/>
-          </w:tcPr>
-          <w:p>
-            <w:r>
-              <w:t>app/notification_service.py → PROMPT_LIBRARY</w:t>
-            </w:r>
-          </w:p>
-        </w:tc>
-      </w:tr>
-      <w:tr>
-        <w:tc>
-          <w:tcPr>
-            <w:tcW w:type="dxa" w:w="4320"/>
-          </w:tcPr>
-          <w:p>
-            <w:r>
-              <w:t>Status</w:t>
-            </w:r>
-          </w:p>
-        </w:tc>
-        <w:tc>
-          <w:tcPr>
-            <w:tcW w:type="dxa" w:w="4320"/>
-          </w:tcPr>
-          <w:p>
-            <w:r>
-              <w:t>Single default prompt — JITAI_DEFAULT_PROMPT_ID env var</w:t>
-            </w:r>
-          </w:p>
-        </w:tc>
-      </w:tr>
-      <w:tr>
-        <w:tc>
-          <w:tcPr>
-            <w:tcW w:type="dxa" w:w="4320"/>
-          </w:tcPr>
-          <w:p>
-            <w:r>
-              <w:t>Action needed</w:t>
-            </w:r>
-          </w:p>
-        </w:tc>
-        <w:tc>
-          <w:tcPr>
-            <w:tcW w:type="dxa" w:w="4320"/>
-          </w:tcPr>
-          <w:p>
-            <w:r>
-              <w:t>Prof. Chang to define the prompt library (message templates keyed by trigger type)</w:t>
-            </w:r>
-          </w:p>
-        </w:tc>
-      </w:tr>
-    </w:tbl>
-    <w:p/>
-    <w:p>
-      <w:r>
-        <w:t>How it connects: The decision engine returns a trigger_reason string. The six possible values are listed below. Once a prompt library exists, map trigger reasons → prompt IDs in PROMPT_LIBRARY. The React Native app holds the message text locally and displays it by prompt_id. Only the key ever reaches the backend (IRB constraint).</w:t>
-      </w:r>
-    </w:p>
-    <w:p/>
-    <w:tbl>
-      <w:tblPr>
-        <w:tblStyle w:val="TableGrid"/>
-        <w:tblW w:type="auto" w:w="0"/>
-        <w:tblLook w:firstColumn="1" w:firstRow="1" w:lastColumn="0" w:lastRow="0" w:noHBand="0" w:noVBand="1" w:val="04A0"/>
-      </w:tblPr>
-      <w:tblGrid>
-        <w:gridCol w:w="4320"/>
-        <w:gridCol w:w="4320"/>
-      </w:tblGrid>
-      <w:tr>
-        <w:tc>
-          <w:tcPr>
-            <w:tcW w:type="dxa" w:w="4320"/>
-          </w:tcPr>
-          <w:p>
-            <w:r>
-              <w:rPr>
-                <w:b/>
-              </w:rPr>
-              <w:t>trigger_reason value</w:t>
-            </w:r>
-          </w:p>
-        </w:tc>
-        <w:tc>
-          <w:tcPr>
-            <w:tcW w:type="dxa" w:w="4320"/>
-          </w:tcPr>
-          <w:p>
-            <w:r>
-              <w:rPr>
-                <w:b/>
-              </w:rPr>
-              <w:t>Meaning</w:t>
-            </w:r>
-          </w:p>
-        </w:tc>
-      </w:tr>
-      <w:tr>
-        <w:tc>
-          <w:tcPr>
-            <w:tcW w:type="dxa" w:w="4320"/>
-          </w:tcPr>
-          <w:p>
-            <w:r>
-              <w:t>"prompt sent"</w:t>
-            </w:r>
-          </w:p>
-        </w:tc>
-        <w:tc>
-          <w:tcPr>
-            <w:tcW w:type="dxa" w:w="4320"/>
-          </w:tcPr>
-          <w:p>
-            <w:r>
-              <w:t>MSSD above within-person threshold — prompt was fired</w:t>
-            </w:r>
-          </w:p>
-        </w:tc>
-      </w:tr>
-      <w:tr>
-        <w:tc>
-          <w:tcPr>
-            <w:tcW w:type="dxa" w:w="4320"/>
-          </w:tcPr>
-          <w:p>
-            <w:r>
-              <w:t>"below within-person threshold"</w:t>
-            </w:r>
-          </w:p>
-        </w:tc>
-        <w:tc>
-          <w:tcPr>
-            <w:tcW w:type="dxa" w:w="4320"/>
-          </w:tcPr>
-          <w:p>
-            <w:r>
-              <w:t>MSSD computed but not high enough; no prompt</w:t>
-            </w:r>
-          </w:p>
-        </w:tc>
-      </w:tr>
-      <w:tr>
-        <w:tc>
-          <w:tcPr>
-            <w:tcW w:type="dxa" w:w="4320"/>
-          </w:tcPr>
-          <w:p>
-            <w:r>
-              <w:t>"insufficient within-person history"</w:t>
-            </w:r>
-          </w:p>
-        </w:tc>
-        <w:tc>
-          <w:tcPr>
-            <w:tcW w:type="dxa" w:w="4320"/>
-          </w:tcPr>
-          <w:p>
-            <w:r>
-              <w:t>Fewer than 3 non-null MSSD values yet</w:t>
-            </w:r>
-          </w:p>
-        </w:tc>
-      </w:tr>
-      <w:tr>
-        <w:tc>
-          <w:tcPr>
-            <w:tcW w:type="dxa" w:w="4320"/>
-          </w:tcPr>
-          <w:p>
-            <w:r>
-              <w:t>"missing or insufficient EMA data"</w:t>
-            </w:r>
-          </w:p>
-        </w:tc>
-        <w:tc>
-          <w:tcPr>
-            <w:tcW w:type="dxa" w:w="4320"/>
-          </w:tcPr>
-          <w:p>
-            <w:r>
-              <w:t>EMA row has null Likert scores</w:t>
-            </w:r>
-          </w:p>
-        </w:tc>
-      </w:tr>
-      <w:tr>
-        <w:tc>
-          <w:tcPr>
-            <w:tcW w:type="dxa" w:w="4320"/>
-          </w:tcPr>
-          <w:p>
-            <w:r>
-              <w:t>"cooldown active"</w:t>
-            </w:r>
-          </w:p>
-        </w:tc>
-        <w:tc>
-          <w:tcPr>
-            <w:tcW w:type="dxa" w:w="4320"/>
-          </w:tcPr>
-          <w:p>
-            <w:r>
-              <w:t>Last prompt was within 60 min (configurable)</w:t>
-            </w:r>
-          </w:p>
-        </w:tc>
-      </w:tr>
-      <w:tr>
-        <w:tc>
-          <w:tcPr>
-            <w:tcW w:type="dxa" w:w="4320"/>
-          </w:tcPr>
-          <w:p>
-            <w:r>
-              <w:t>"daily cap reached"</w:t>
-            </w:r>
-          </w:p>
-        </w:tc>
-        <w:tc>
-          <w:tcPr>
-            <w:tcW w:type="dxa" w:w="4320"/>
-          </w:tcPr>
-          <w:p>
-            <w:r>
-              <w:t>Already sent 4 prompts today (configurable)</w:t>
-            </w:r>
-          </w:p>
-        </w:tc>
-      </w:tr>
-    </w:tbl>
-    <w:p>
-      <w:pPr>
-        <w:pStyle w:val="Heading1"/>
-      </w:pPr>
-      <w:r>
-        <w:t>4  Open Research / Contract Questions</w:t>
-      </w:r>
-    </w:p>
-    <w:tbl>
-      <w:tblPr>
-        <w:tblStyle w:val="TableGrid"/>
+        <w:tblStyle w:val="LightGrid-Accent1"/>
         <w:tblW w:type="auto" w:w="0"/>
         <w:tblLook w:firstColumn="1" w:firstRow="1" w:lastColumn="0" w:lastRow="0" w:noHBand="0" w:noVBand="1" w:val="04A0"/>
       </w:tblPr>
@@ -819,6 +1464,7 @@
             <w:r>
               <w:rPr>
                 <w:b/>
+                <w:sz w:val="18"/>
               </w:rPr>
               <w:t>Question</w:t>
             </w:r>
@@ -832,6 +1478,7 @@
             <w:r>
               <w:rPr>
                 <w:b/>
+                <w:sz w:val="18"/>
               </w:rPr>
               <w:t>Owner</w:t>
             </w:r>
@@ -845,6 +1492,7 @@
             <w:r>
               <w:rPr>
                 <w:b/>
+                <w:sz w:val="18"/>
               </w:rPr>
               <w:t>Notes</w:t>
             </w:r>
@@ -858,6 +1506,9 @@
           </w:tcPr>
           <w:p>
             <w:r>
+              <w:rPr>
+                <w:sz w:val="18"/>
+              </w:rPr>
               <w:t>Labfront API vs batch export</w:t>
             </w:r>
           </w:p>
@@ -868,6 +1519,9 @@
           </w:tcPr>
           <w:p>
             <w:r>
+              <w:rPr>
+                <w:sz w:val="18"/>
+              </w:rPr>
               <w:t>Prof. Chang</w:t>
             </w:r>
           </w:p>
@@ -878,7 +1532,17 @@
           </w:tcPr>
           <w:p>
             <w:r>
-              <w:t>Determine pricing and access tier before writing ingest_wearable_data</w:t>
+              <w:rPr>
+                <w:sz w:val="18"/>
+              </w:rPr>
+              <w:t xml:space="preserve">Determine pricing and access tier before writing </w:t>
+            </w:r>
+            <w:r>
+              <w:rPr>
+                <w:rFonts w:ascii="Consolas" w:hAnsi="Consolas"/>
+                <w:sz w:val="18"/>
+              </w:rPr>
+              <w:t>ingest_wearable_data</w:t>
             </w:r>
           </w:p>
         </w:tc>
@@ -890,6 +1554,9 @@
           </w:tcPr>
           <w:p>
             <w:r>
+              <w:rPr>
+                <w:sz w:val="18"/>
+              </w:rPr>
               <w:t>Garmin Venu 3 Labfront compatibility</w:t>
             </w:r>
           </w:p>
@@ -900,6 +1567,9 @@
           </w:tcPr>
           <w:p>
             <w:r>
+              <w:rPr>
+                <w:sz w:val="18"/>
+              </w:rPr>
               <w:t>Prof. Chang</w:t>
             </w:r>
           </w:p>
@@ -910,6 +1580,9 @@
           </w:tcPr>
           <w:p>
             <w:r>
+              <w:rPr>
+                <w:sz w:val="18"/>
+              </w:rPr>
               <w:t>Verify all required data streams (15-sec HR, 3-min stress) are supported before signing contract</w:t>
             </w:r>
           </w:p>
@@ -922,6 +1595,9 @@
           </w:tcPr>
           <w:p>
             <w:r>
+              <w:rPr>
+                <w:sz w:val="18"/>
+              </w:rPr>
               <w:t>Beat-to-beat RR interval collection</w:t>
             </w:r>
           </w:p>
@@ -932,6 +1608,9 @@
           </w:tcPr>
           <w:p>
             <w:r>
+              <w:rPr>
+                <w:sz w:val="18"/>
+              </w:rPr>
               <w:t>Prof. Chang</w:t>
             </w:r>
           </w:p>
@@ -942,6 +1621,9 @@
           </w:tcPr>
           <w:p>
             <w:r>
+              <w:rPr>
+                <w:sz w:val="18"/>
+              </w:rPr>
               <w:t>Confirm device support and IRB permission; would enable HRV analysis</w:t>
             </w:r>
           </w:p>
@@ -954,6 +1636,9 @@
           </w:tcPr>
           <w:p>
             <w:r>
+              <w:rPr>
+                <w:sz w:val="18"/>
+              </w:rPr>
               <w:t>RA access scope</w:t>
             </w:r>
           </w:p>
@@ -964,6 +1649,9 @@
           </w:tcPr>
           <w:p>
             <w:r>
+              <w:rPr>
+                <w:sz w:val="18"/>
+              </w:rPr>
               <w:t>Prof. Chang + IRB</w:t>
             </w:r>
           </w:p>
@@ -974,6 +1662,9 @@
           </w:tcPr>
           <w:p>
             <w:r>
+              <w:rPr>
+                <w:sz w:val="18"/>
+              </w:rPr>
               <w:t>Which fields, which tables; needed before building researcher dashboard</w:t>
             </w:r>
           </w:p>
@@ -986,7 +1677,10 @@
           </w:tcPr>
           <w:p>
             <w:r>
-              <w:t>JITAI threshold values</w:t>
+              <w:rPr>
+                <w:sz w:val="18"/>
+              </w:rPr>
+              <w:t>Alcohol and eating construct — DB fields needed?</w:t>
             </w:r>
           </w:p>
         </w:tc>
@@ -996,6 +1690,9 @@
           </w:tcPr>
           <w:p>
             <w:r>
+              <w:rPr>
+                <w:sz w:val="18"/>
+              </w:rPr>
               <w:t>Prof. Chang</w:t>
             </w:r>
           </w:p>
@@ -1006,7 +1703,10 @@
           </w:tcPr>
           <w:p>
             <w:r>
-              <w:t>Confirm or adjust decision engine defaults (0.80 quantile, 60 min cooldown, 4/day cap)</w:t>
+              <w:rPr>
+                <w:sz w:val="18"/>
+              </w:rPr>
+              <w:t>These constructs currently have zero DB backing; confirm if DB fields are required or Qualtrics is sole source</w:t>
             </w:r>
           </w:p>
         </w:tc>
@@ -1018,7 +1718,10 @@
           </w:tcPr>
           <w:p>
             <w:r>
-              <w:t>Push notification prompt library</w:t>
+              <w:rPr>
+                <w:sz w:val="18"/>
+              </w:rPr>
+              <w:t>Cyber aggression construct mapping</w:t>
             </w:r>
           </w:p>
         </w:tc>
@@ -1028,6 +1731,9 @@
           </w:tcPr>
           <w:p>
             <w:r>
+              <w:rPr>
+                <w:sz w:val="18"/>
+              </w:rPr>
               <w:t>Prof. Chang</w:t>
             </w:r>
           </w:p>
@@ -1038,23 +1744,756 @@
           </w:tcPr>
           <w:p>
             <w:r>
-              <w:t>Define prompt templates and trigger-reason → prompt_id mapping</w:t>
+              <w:rPr>
+                <w:sz w:val="18"/>
+              </w:rPr>
+              <w:t>Confirm compose churn signals (keystroke_count, delete_count) are the designated DB measure</w:t>
             </w:r>
           </w:p>
         </w:tc>
       </w:tr>
     </w:tbl>
+    <w:p/>
     <w:p>
       <w:pPr>
         <w:pStyle w:val="Heading1"/>
       </w:pPr>
       <w:r>
-        <w:t>5  Technical Debt / Known Issues</w:t>
+        <w:t>PI Sign-Offs Received (2026-07-06)</w:t>
       </w:r>
     </w:p>
     <w:tbl>
       <w:tblPr>
-        <w:tblStyle w:val="TableGrid"/>
+        <w:tblStyle w:val="LightGrid-Accent1"/>
+        <w:tblW w:type="auto" w:w="0"/>
+        <w:tblLook w:firstColumn="1" w:firstRow="1" w:lastColumn="0" w:lastRow="0" w:noHBand="0" w:noVBand="1" w:val="04A0"/>
+      </w:tblPr>
+      <w:tblGrid>
+        <w:gridCol w:w="4320"/>
+        <w:gridCol w:w="4320"/>
+      </w:tblGrid>
+      <w:tr>
+        <w:tc>
+          <w:tcPr>
+            <w:tcW w:type="dxa" w:w="4320"/>
+          </w:tcPr>
+          <w:p>
+            <w:r>
+              <w:rPr>
+                <w:b/>
+                <w:sz w:val="18"/>
+              </w:rPr>
+              <w:t>Item</w:t>
+            </w:r>
+          </w:p>
+        </w:tc>
+        <w:tc>
+          <w:tcPr>
+            <w:tcW w:type="dxa" w:w="4320"/>
+          </w:tcPr>
+          <w:p>
+            <w:r>
+              <w:rPr>
+                <w:b/>
+                <w:sz w:val="18"/>
+              </w:rPr>
+              <w:t>Confirmed value</w:t>
+            </w:r>
+          </w:p>
+        </w:tc>
+      </w:tr>
+      <w:tr>
+        <w:tc>
+          <w:tcPr>
+            <w:tcW w:type="dxa" w:w="4320"/>
+          </w:tcPr>
+          <w:p>
+            <w:r>
+              <w:rPr>
+                <w:sz w:val="18"/>
+              </w:rPr>
+              <w:t>Randomization probability p</w:t>
+            </w:r>
+          </w:p>
+        </w:tc>
+        <w:tc>
+          <w:tcPr>
+            <w:tcW w:type="dxa" w:w="4320"/>
+          </w:tcPr>
+          <w:p>
+            <w:r>
+              <w:rPr>
+                <w:sz w:val="18"/>
+              </w:rPr>
+              <w:t>0.5, fixed for whole pilot</w:t>
+            </w:r>
+          </w:p>
+        </w:tc>
+      </w:tr>
+      <w:tr>
+        <w:tc>
+          <w:tcPr>
+            <w:tcW w:type="dxa" w:w="4320"/>
+          </w:tcPr>
+          <w:p>
+            <w:r>
+              <w:rPr>
+                <w:sz w:val="18"/>
+              </w:rPr>
+              <w:t>Decision point trigger</w:t>
+            </w:r>
+          </w:p>
+        </w:tc>
+        <w:tc>
+          <w:tcPr>
+            <w:tcW w:type="dxa" w:w="4320"/>
+          </w:tcPr>
+          <w:p>
+            <w:r>
+              <w:rPr>
+                <w:sz w:val="18"/>
+              </w:rPr>
+              <w:t>EMA completion — one DP per new completed EMA</w:t>
+            </w:r>
+          </w:p>
+        </w:tc>
+      </w:tr>
+      <w:tr>
+        <w:tc>
+          <w:tcPr>
+            <w:tcW w:type="dxa" w:w="4320"/>
+          </w:tcPr>
+          <w:p>
+            <w:r>
+              <w:rPr>
+                <w:sz w:val="18"/>
+              </w:rPr>
+              <w:t>HR/stress eligibility gating</w:t>
+            </w:r>
+          </w:p>
+        </w:tc>
+        <w:tc>
+          <w:tcPr>
+            <w:tcW w:type="dxa" w:w="4320"/>
+          </w:tcPr>
+          <w:p>
+            <w:r>
+              <w:rPr>
+                <w:sz w:val="18"/>
+              </w:rPr>
+              <w:t>No — covariates only; MSSD is the sole eligibility signal</w:t>
+            </w:r>
+          </w:p>
+        </w:tc>
+      </w:tr>
+      <w:tr>
+        <w:tc>
+          <w:tcPr>
+            <w:tcW w:type="dxa" w:w="4320"/>
+          </w:tcPr>
+          <w:p>
+            <w:r>
+              <w:rPr>
+                <w:sz w:val="18"/>
+              </w:rPr>
+              <w:t>Cooldown between prompts</w:t>
+            </w:r>
+          </w:p>
+        </w:tc>
+        <w:tc>
+          <w:tcPr>
+            <w:tcW w:type="dxa" w:w="4320"/>
+          </w:tcPr>
+          <w:p>
+            <w:r>
+              <w:rPr>
+                <w:sz w:val="18"/>
+              </w:rPr>
+              <w:t>60 minutes</w:t>
+            </w:r>
+          </w:p>
+        </w:tc>
+      </w:tr>
+      <w:tr>
+        <w:tc>
+          <w:tcPr>
+            <w:tcW w:type="dxa" w:w="4320"/>
+          </w:tcPr>
+          <w:p>
+            <w:r>
+              <w:rPr>
+                <w:sz w:val="18"/>
+              </w:rPr>
+              <w:t>Daily prompt cap</w:t>
+            </w:r>
+          </w:p>
+        </w:tc>
+        <w:tc>
+          <w:tcPr>
+            <w:tcW w:type="dxa" w:w="4320"/>
+          </w:tcPr>
+          <w:p>
+            <w:r>
+              <w:rPr>
+                <w:sz w:val="18"/>
+              </w:rPr>
+              <w:t>4 per day</w:t>
+            </w:r>
+          </w:p>
+        </w:tc>
+      </w:tr>
+      <w:tr>
+        <w:tc>
+          <w:tcPr>
+            <w:tcW w:type="dxa" w:w="4320"/>
+          </w:tcPr>
+          <w:p>
+            <w:r>
+              <w:rPr>
+                <w:sz w:val="18"/>
+              </w:rPr>
+              <w:t>Failed delivery retry policy</w:t>
+            </w:r>
+          </w:p>
+        </w:tc>
+        <w:tc>
+          <w:tcPr>
+            <w:tcW w:type="dxa" w:w="4320"/>
+          </w:tcPr>
+          <w:p>
+            <w:r>
+              <w:rPr>
+                <w:sz w:val="18"/>
+              </w:rPr>
+              <w:t>One immediate retry for transient Expo errors; no delayed redelivery</w:t>
+            </w:r>
+          </w:p>
+        </w:tc>
+      </w:tr>
+      <w:tr>
+        <w:tc>
+          <w:tcPr>
+            <w:tcW w:type="dxa" w:w="4320"/>
+          </w:tcPr>
+          <w:p>
+            <w:r>
+              <w:rPr>
+                <w:sz w:val="18"/>
+              </w:rPr>
+              <w:t>JITAI trigger threshold quantile</w:t>
+            </w:r>
+          </w:p>
+        </w:tc>
+        <w:tc>
+          <w:tcPr>
+            <w:tcW w:type="dxa" w:w="4320"/>
+          </w:tcPr>
+          <w:p>
+            <w:r>
+              <w:rPr>
+                <w:sz w:val="18"/>
+              </w:rPr>
+              <w:t>0.80 within-person expanding percentile (confirmed as default)</w:t>
+            </w:r>
+          </w:p>
+        </w:tc>
+      </w:tr>
+    </w:tbl>
+    <w:p/>
+    <w:p>
+      <w:pPr>
+        <w:pStyle w:val="Heading1"/>
+      </w:pPr>
+      <w:r>
+        <w:t>Completed Implementation</w:t>
+      </w:r>
+    </w:p>
+    <w:p>
+      <w:pPr>
+        <w:pStyle w:val="Heading2"/>
+      </w:pPr>
+      <w:r>
+        <w:t>JITAI MRT Celery Task (2026-07-06)</w:t>
+      </w:r>
+    </w:p>
+    <w:p>
+      <w:r>
+        <w:rPr>
+          <w:b/>
+        </w:rPr>
+        <w:t>Commits:</w:t>
+      </w:r>
+      <w:r>
+        <w:t xml:space="preserve"> </w:t>
+      </w:r>
+      <w:r>
+        <w:rPr>
+          <w:rFonts w:ascii="Consolas" w:hAnsi="Consolas"/>
+          <w:sz w:val="20"/>
+        </w:rPr>
+        <w:t>9d87afb</w:t>
+      </w:r>
+      <w:r>
+        <w:t xml:space="preserve"> → </w:t>
+      </w:r>
+      <w:r>
+        <w:rPr>
+          <w:rFonts w:ascii="Consolas" w:hAnsi="Consolas"/>
+          <w:sz w:val="20"/>
+        </w:rPr>
+        <w:t>a149033</w:t>
+      </w:r>
+      <w:r>
+        <w:t xml:space="preserve"> (branch </w:t>
+      </w:r>
+      <w:r>
+        <w:rPr>
+          <w:rFonts w:ascii="Consolas" w:hAnsi="Consolas"/>
+          <w:sz w:val="20"/>
+        </w:rPr>
+        <w:t>feat-Final-Database-Model</w:t>
+      </w:r>
+      <w:r>
+        <w:t xml:space="preserve">) </w:t>
+      </w:r>
+      <w:r>
+        <w:rPr>
+          <w:b/>
+        </w:rPr>
+        <w:t>Files changed:</w:t>
+      </w:r>
+      <w:r>
+        <w:t xml:space="preserve"> </w:t>
+      </w:r>
+      <w:r>
+        <w:rPr>
+          <w:rFonts w:ascii="Consolas" w:hAnsi="Consolas"/>
+          <w:sz w:val="20"/>
+        </w:rPr>
+        <w:t>app/models.py</w:t>
+      </w:r>
+      <w:r>
+        <w:t xml:space="preserve">, </w:t>
+      </w:r>
+      <w:r>
+        <w:rPr>
+          <w:rFonts w:ascii="Consolas" w:hAnsi="Consolas"/>
+          <w:sz w:val="20"/>
+        </w:rPr>
+        <w:t>app/migrations/0035_jitailog_mrt_fields.py</w:t>
+      </w:r>
+      <w:r>
+        <w:t xml:space="preserve">, </w:t>
+      </w:r>
+      <w:r>
+        <w:rPr>
+          <w:rFonts w:ascii="Consolas" w:hAnsi="Consolas"/>
+          <w:sz w:val="20"/>
+        </w:rPr>
+        <w:t>decision_engine/decision_engine.py</w:t>
+      </w:r>
+      <w:r>
+        <w:t xml:space="preserve">, </w:t>
+      </w:r>
+      <w:r>
+        <w:rPr>
+          <w:rFonts w:ascii="Consolas" w:hAnsi="Consolas"/>
+          <w:sz w:val="20"/>
+        </w:rPr>
+        <w:t>app/tasks.py</w:t>
+      </w:r>
+      <w:r>
+        <w:t xml:space="preserve">, </w:t>
+      </w:r>
+      <w:r>
+        <w:rPr>
+          <w:rFonts w:ascii="Consolas" w:hAnsi="Consolas"/>
+          <w:sz w:val="20"/>
+        </w:rPr>
+        <w:t>app/notification_service.py</w:t>
+      </w:r>
+      <w:r>
+        <w:t xml:space="preserve">, </w:t>
+      </w:r>
+      <w:r>
+        <w:rPr>
+          <w:rFonts w:ascii="Consolas" w:hAnsi="Consolas"/>
+          <w:sz w:val="20"/>
+        </w:rPr>
+        <w:t>app/serializers.py</w:t>
+      </w:r>
+      <w:r>
+        <w:t xml:space="preserve">, </w:t>
+      </w:r>
+      <w:r>
+        <w:rPr>
+          <w:rFonts w:ascii="Consolas" w:hAnsi="Consolas"/>
+          <w:sz w:val="20"/>
+        </w:rPr>
+        <w:t>app/tests.py</w:t>
+      </w:r>
+      <w:r>
+        <w:t xml:space="preserve"> </w:t>
+      </w:r>
+      <w:r>
+        <w:rPr>
+          <w:b/>
+        </w:rPr>
+        <w:t>Test count:</w:t>
+      </w:r>
+      <w:r>
+        <w:t xml:space="preserve"> 152 → 176 (all passing)</w:t>
+      </w:r>
+    </w:p>
+    <w:p>
+      <w:r>
+        <w:t>What was built:</w:t>
+      </w:r>
+    </w:p>
+    <w:p>
+      <w:pPr>
+        <w:pStyle w:val="ListBullet"/>
+      </w:pPr>
+      <w:r>
+        <w:rPr>
+          <w:rFonts w:ascii="Consolas" w:hAnsi="Consolas"/>
+          <w:sz w:val="20"/>
+        </w:rPr>
+        <w:t>JITAILog</w:t>
+      </w:r>
+      <w:r>
+        <w:t xml:space="preserve"> schema — </w:t>
+      </w:r>
+      <w:r>
+        <w:rPr>
+          <w:rFonts w:ascii="Consolas" w:hAnsi="Consolas"/>
+          <w:sz w:val="20"/>
+        </w:rPr>
+        <w:t>decision_point_id</w:t>
+      </w:r>
+      <w:r>
+        <w:t xml:space="preserve"> (UNIQUE, idempotency key), </w:t>
+      </w:r>
+      <w:r>
+        <w:rPr>
+          <w:rFonts w:ascii="Consolas" w:hAnsi="Consolas"/>
+          <w:sz w:val="20"/>
+        </w:rPr>
+        <w:t>randomization_probability</w:t>
+      </w:r>
+      <w:r>
+        <w:t xml:space="preserve">, </w:t>
+      </w:r>
+      <w:r>
+        <w:rPr>
+          <w:rFonts w:ascii="Consolas" w:hAnsi="Consolas"/>
+          <w:sz w:val="20"/>
+        </w:rPr>
+        <w:t>randomization_draw</w:t>
+      </w:r>
+      <w:r>
+        <w:t xml:space="preserve">; status choices expanded to include </w:t>
+      </w:r>
+      <w:r>
+        <w:rPr>
+          <w:rFonts w:ascii="Consolas" w:hAnsi="Consolas"/>
+          <w:sz w:val="20"/>
+        </w:rPr>
+        <w:t>pending</w:t>
+      </w:r>
+      <w:r>
+        <w:t xml:space="preserve"> and </w:t>
+      </w:r>
+      <w:r>
+        <w:rPr>
+          <w:rFonts w:ascii="Consolas" w:hAnsi="Consolas"/>
+          <w:sz w:val="20"/>
+        </w:rPr>
+        <w:t>not_sent</w:t>
+      </w:r>
+      <w:r>
+        <w:t xml:space="preserve">; default changed to </w:t>
+      </w:r>
+      <w:r>
+        <w:rPr>
+          <w:rFonts w:ascii="Consolas" w:hAnsi="Consolas"/>
+          <w:sz w:val="20"/>
+        </w:rPr>
+        <w:t>pending</w:t>
+      </w:r>
+    </w:p>
+    <w:p>
+      <w:pPr>
+        <w:pStyle w:val="ListBullet"/>
+      </w:pPr>
+      <w:r>
+        <w:t xml:space="preserve">Decision engine — </w:t>
+      </w:r>
+      <w:r>
+        <w:rPr>
+          <w:rFonts w:ascii="Consolas" w:hAnsi="Consolas"/>
+          <w:sz w:val="20"/>
+        </w:rPr>
+        <w:t>apply_decision_rules()</w:t>
+      </w:r>
+      <w:r>
+        <w:t xml:space="preserve"> now returns </w:t>
+      </w:r>
+      <w:r>
+        <w:rPr>
+          <w:rFonts w:ascii="Consolas" w:hAnsi="Consolas"/>
+          <w:sz w:val="20"/>
+        </w:rPr>
+        <w:t>eligible</w:t>
+      </w:r>
+      <w:r>
+        <w:t xml:space="preserve"> column (not </w:t>
+      </w:r>
+      <w:r>
+        <w:rPr>
+          <w:rFonts w:ascii="Consolas" w:hAnsi="Consolas"/>
+          <w:sz w:val="20"/>
+        </w:rPr>
+        <w:t>send_prompt</w:t>
+      </w:r>
+      <w:r>
+        <w:t>); coin flip moved to task layer</w:t>
+      </w:r>
+    </w:p>
+    <w:p>
+      <w:pPr>
+        <w:pStyle w:val="ListBullet"/>
+      </w:pPr>
+      <w:r>
+        <w:rPr>
+          <w:rFonts w:ascii="Consolas" w:hAnsi="Consolas"/>
+          <w:sz w:val="20"/>
+        </w:rPr>
+        <w:t>_evaluate_user</w:t>
+      </w:r>
+      <w:r>
+        <w:t xml:space="preserve"> — </w:t>
+      </w:r>
+      <w:r>
+        <w:rPr>
+          <w:rFonts w:ascii="Consolas" w:hAnsi="Consolas"/>
+          <w:sz w:val="20"/>
+        </w:rPr>
+        <w:t>get_or_create</w:t>
+      </w:r>
+      <w:r>
+        <w:t xml:space="preserve"> idempotency, coin flip at p=0.5, full MRT record written before delivery</w:t>
+      </w:r>
+    </w:p>
+    <w:p>
+      <w:pPr>
+        <w:pStyle w:val="ListBullet"/>
+      </w:pPr>
+      <w:r>
+        <w:rPr>
+          <w:rFonts w:ascii="Consolas" w:hAnsi="Consolas"/>
+          <w:sz w:val="20"/>
+        </w:rPr>
+        <w:t>send_jitai_prompt</w:t>
+      </w:r>
+      <w:r>
+        <w:t xml:space="preserve"> — one immediate retry on </w:t>
+      </w:r>
+      <w:r>
+        <w:rPr>
+          <w:rFonts w:ascii="Consolas" w:hAnsi="Consolas"/>
+          <w:sz w:val="20"/>
+        </w:rPr>
+        <w:t>PushServerError</w:t>
+      </w:r>
+      <w:r>
+        <w:t>/</w:t>
+      </w:r>
+      <w:r>
+        <w:rPr>
+          <w:rFonts w:ascii="Consolas" w:hAnsi="Consolas"/>
+          <w:sz w:val="20"/>
+        </w:rPr>
+        <w:t>PushTicketError</w:t>
+      </w:r>
+      <w:r>
+        <w:t xml:space="preserve">; </w:t>
+      </w:r>
+      <w:r>
+        <w:rPr>
+          <w:rFonts w:ascii="Consolas" w:hAnsi="Consolas"/>
+          <w:sz w:val="20"/>
+        </w:rPr>
+        <w:t>status='delivered'</w:t>
+      </w:r>
+      <w:r>
+        <w:t xml:space="preserve"> set explicitly on success; </w:t>
+      </w:r>
+      <w:r>
+        <w:rPr>
+          <w:rFonts w:ascii="Consolas" w:hAnsi="Consolas"/>
+          <w:sz w:val="20"/>
+        </w:rPr>
+        <w:t>DeviceNotRegisteredError</w:t>
+      </w:r>
+      <w:r>
+        <w:t xml:space="preserve"> clears token</w:t>
+      </w:r>
+    </w:p>
+    <w:p>
+      <w:pPr>
+        <w:pStyle w:val="ListBullet"/>
+      </w:pPr>
+      <w:r>
+        <w:t xml:space="preserve">Serializers — </w:t>
+      </w:r>
+      <w:r>
+        <w:rPr>
+          <w:rFonts w:ascii="Consolas" w:hAnsi="Consolas"/>
+          <w:sz w:val="20"/>
+        </w:rPr>
+        <w:t>JITAILogSerializer</w:t>
+      </w:r>
+      <w:r>
+        <w:t xml:space="preserve"> and </w:t>
+      </w:r>
+      <w:r>
+        <w:rPr>
+          <w:rFonts w:ascii="Consolas" w:hAnsi="Consolas"/>
+          <w:sz w:val="20"/>
+        </w:rPr>
+        <w:t>TelemetryJITAILogSerializer</w:t>
+      </w:r>
+      <w:r>
+        <w:t xml:space="preserve"> expose all three new fields</w:t>
+      </w:r>
+    </w:p>
+    <w:p/>
+    <w:p>
+      <w:pPr>
+        <w:pStyle w:val="Heading1"/>
+      </w:pPr>
+      <w:r>
+        <w:t>Technical Debt / Known Issues</w:t>
+      </w:r>
+    </w:p>
+    <w:p>
+      <w:pPr>
+        <w:pStyle w:val="Heading2"/>
+      </w:pPr>
+      <w:r>
+        <w:t>`screen_name` Vocabulary on PhoneTelemetry</w:t>
+      </w:r>
+    </w:p>
+    <w:p>
+      <w:r>
+        <w:rPr>
+          <w:b/>
+        </w:rPr>
+        <w:t>File:</w:t>
+      </w:r>
+      <w:r>
+        <w:t xml:space="preserve"> </w:t>
+      </w:r>
+      <w:r>
+        <w:rPr>
+          <w:rFonts w:ascii="Consolas" w:hAnsi="Consolas"/>
+          <w:sz w:val="20"/>
+        </w:rPr>
+        <w:t>app/models.py</w:t>
+      </w:r>
+      <w:r>
+        <w:t xml:space="preserve"> — </w:t>
+      </w:r>
+      <w:r>
+        <w:rPr>
+          <w:rFonts w:ascii="Consolas" w:hAnsi="Consolas"/>
+          <w:sz w:val="20"/>
+        </w:rPr>
+        <w:t>PhoneTelemetry.screen_name</w:t>
+      </w:r>
+      <w:r>
+        <w:t xml:space="preserve"> field </w:t>
+      </w:r>
+      <w:r>
+        <w:rPr>
+          <w:b/>
+        </w:rPr>
+        <w:t>Issue:</w:t>
+      </w:r>
+      <w:r>
+        <w:t xml:space="preserve"> Field is nullable pending a controlled vocabulary from Prof. Chang </w:t>
+      </w:r>
+      <w:r>
+        <w:rPr>
+          <w:b/>
+        </w:rPr>
+        <w:t>Action:</w:t>
+      </w:r>
+      <w:r>
+        <w:t xml:space="preserve"> Once screen names are defined in the React Native app, add a </w:t>
+      </w:r>
+      <w:r>
+        <w:rPr>
+          <w:rFonts w:ascii="Consolas" w:hAnsi="Consolas"/>
+          <w:sz w:val="20"/>
+        </w:rPr>
+        <w:t>choices</w:t>
+      </w:r>
+      <w:r>
+        <w:t xml:space="preserve"> constraint and make the field non-nullable</w:t>
+      </w:r>
+    </w:p>
+    <w:p>
+      <w:pPr>
+        <w:pStyle w:val="Heading2"/>
+      </w:pPr>
+      <w:r>
+        <w:t>JITAI: `'0.5'` hardcoded as env var fallback</w:t>
+      </w:r>
+    </w:p>
+    <w:p>
+      <w:r>
+        <w:rPr>
+          <w:b/>
+        </w:rPr>
+        <w:t>File:</w:t>
+      </w:r>
+      <w:r>
+        <w:t xml:space="preserve"> </w:t>
+      </w:r>
+      <w:r>
+        <w:rPr>
+          <w:rFonts w:ascii="Consolas" w:hAnsi="Consolas"/>
+          <w:sz w:val="20"/>
+        </w:rPr>
+        <w:t>app/tasks.py:29</w:t>
+      </w:r>
+      <w:r>
+        <w:t xml:space="preserve"> </w:t>
+      </w:r>
+      <w:r>
+        <w:rPr>
+          <w:b/>
+        </w:rPr>
+        <w:t>Status:</w:t>
+      </w:r>
+      <w:r>
+        <w:t xml:space="preserve"> Still present, but no longer a real risk — the PI Sign-Offs table above confirms 0.5 fixed for the whole pilot, so defaulting to it is now correct behavior. Low-priority: could still raise/log loudly if the env var is absent, purely as a startup sanity check.</w:t>
+      </w:r>
+    </w:p>
+    <w:p/>
+    <w:p>
+      <w:pPr>
+        <w:pStyle w:val="Heading1"/>
+      </w:pPr>
+      <w:r>
+        <w:t>Environment Variables Required (Not Yet Set in Heroku)</w:t>
+      </w:r>
+    </w:p>
+    <w:tbl>
+      <w:tblPr>
+        <w:tblStyle w:val="LightGrid-Accent1"/>
         <w:tblW w:type="auto" w:w="0"/>
         <w:tblLook w:firstColumn="1" w:firstRow="1" w:lastColumn="0" w:lastRow="0" w:noHBand="0" w:noVBand="1" w:val="04A0"/>
       </w:tblPr>
@@ -1072,272 +2511,7 @@
             <w:r>
               <w:rPr>
                 <w:b/>
-              </w:rPr>
-              <w:t>Issue</w:t>
-            </w:r>
-          </w:p>
-        </w:tc>
-        <w:tc>
-          <w:tcPr>
-            <w:tcW w:type="dxa" w:w="2880"/>
-          </w:tcPr>
-          <w:p>
-            <w:r>
-              <w:rPr>
-                <w:b/>
-              </w:rPr>
-              <w:t>File / Location</w:t>
-            </w:r>
-          </w:p>
-        </w:tc>
-        <w:tc>
-          <w:tcPr>
-            <w:tcW w:type="dxa" w:w="2880"/>
-          </w:tcPr>
-          <w:p>
-            <w:r>
-              <w:rPr>
-                <w:b/>
-              </w:rPr>
-              <w:t>Action</w:t>
-            </w:r>
-          </w:p>
-        </w:tc>
-      </w:tr>
-      <w:tr>
-        <w:tc>
-          <w:tcPr>
-            <w:tcW w:type="dxa" w:w="2880"/>
-          </w:tcPr>
-          <w:p>
-            <w:r>
-              <w:t>Legacy poll_cfbd management command</w:t>
-            </w:r>
-          </w:p>
-        </w:tc>
-        <w:tc>
-          <w:tcPr>
-            <w:tcW w:type="dxa" w:w="2880"/>
-          </w:tcPr>
-          <w:p>
-            <w:r>
-              <w:t>app/management/commands/poll_cfbd.py</w:t>
-            </w:r>
-          </w:p>
-        </w:tc>
-        <w:tc>
-          <w:tcPr>
-            <w:tcW w:type="dxa" w:w="2880"/>
-          </w:tcPr>
-          <w:p>
-            <w:r>
-              <w:t>Can be deleted entirely once REACT study launches — HealthyGator legacy code with no role in REACT</w:t>
-            </w:r>
-          </w:p>
-        </w:tc>
-      </w:tr>
-      <w:tr>
-        <w:tc>
-          <w:tcPr>
-            <w:tcW w:type="dxa" w:w="2880"/>
-          </w:tcPr>
-          <w:p>
-            <w:r>
-              <w:t>dj-database-url missing from requirements.txt</w:t>
-            </w:r>
-          </w:p>
-        </w:tc>
-        <w:tc>
-          <w:tcPr>
-            <w:tcW w:type="dxa" w:w="2880"/>
-          </w:tcPr>
-          <w:p>
-            <w:r>
-              <w:t>project/settings.py imports dj_database_url</w:t>
-            </w:r>
-          </w:p>
-        </w:tc>
-        <w:tc>
-          <w:tcPr>
-            <w:tcW w:type="dxa" w:w="2880"/>
-          </w:tcPr>
-          <w:p>
-            <w:r>
-              <w:t>dj-database-url==2.3.0 is in requirements_mac.txt — add it to requirements.txt</w:t>
-            </w:r>
-          </w:p>
-        </w:tc>
-      </w:tr>
-      <w:tr>
-        <w:tc>
-          <w:tcPr>
-            <w:tcW w:type="dxa" w:w="2880"/>
-          </w:tcPr>
-          <w:p>
-            <w:r>
-              <w:t>Swagger API title still reads "Healthy Gator Sports Fan API Viewer"</w:t>
-            </w:r>
-          </w:p>
-        </w:tc>
-        <w:tc>
-          <w:tcPr>
-            <w:tcW w:type="dxa" w:w="2880"/>
-          </w:tcPr>
-          <w:p>
-            <w:r>
-              <w:t>project/urls.py line 27</w:t>
-            </w:r>
-          </w:p>
-        </w:tc>
-        <w:tc>
-          <w:tcPr>
-            <w:tcW w:type="dxa" w:w="2880"/>
-          </w:tcPr>
-          <w:p>
-            <w:r>
-              <w:t>Update to REACT</w:t>
-            </w:r>
-          </w:p>
-        </w:tc>
-      </w:tr>
-      <w:tr>
-        <w:tc>
-          <w:tcPr>
-            <w:tcW w:type="dxa" w:w="2880"/>
-          </w:tcPr>
-          <w:p>
-            <w:r>
-              <w:t>PhoneTelemetry.screen_name has no controlled vocabulary</w:t>
-            </w:r>
-          </w:p>
-        </w:tc>
-        <w:tc>
-          <w:tcPr>
-            <w:tcW w:type="dxa" w:w="2880"/>
-          </w:tcPr>
-          <w:p>
-            <w:r>
-              <w:t>app/models.py — PhoneTelemetry.screen_name</w:t>
-            </w:r>
-          </w:p>
-        </w:tc>
-        <w:tc>
-          <w:tcPr>
-            <w:tcW w:type="dxa" w:w="2880"/>
-          </w:tcPr>
-          <w:p>
-            <w:r>
-              <w:t>Once screen names are defined in the React Native app, add a choices constraint and make the field non-nullable</w:t>
-            </w:r>
-          </w:p>
-        </w:tc>
-      </w:tr>
-    </w:tbl>
-    <w:p>
-      <w:pPr>
-        <w:pStyle w:val="Heading2"/>
-      </w:pPr>
-      <w:r>
-        <w:t>5.1  game_clock_state cache never populated</w:t>
-      </w:r>
-    </w:p>
-    <w:p>
-      <w:pPr/>
-      <w:r>
-        <w:t>get_game_clock_state() in app/utils.py is architecturally correct and stamped on every phone_telemetry and engagement_log row at ingest time. However, no Celery task currently populates the uf_football_games_{year} key in Redis. As a result, every event is stamped game_clock_state="pre" (cache miss fallback). This is acceptable during development but must be resolved before the season starts.</w:t>
-      </w:r>
-    </w:p>
-    <w:p>
-      <w:pPr/>
-      <w:r>
-        <w:t>What needs to be built:</w:t>
-      </w:r>
-    </w:p>
-    <w:p>
-      <w:pPr>
-        <w:pStyle w:val="ListBullet"/>
-      </w:pPr>
-      <w:r>
-        <w:t>A new Celery task (e.g. refresh_game_schedule) that fetches the UF football schedule from the CFBD API and writes it to cache.set("uf_football_games_{year}", games_list, timeout=86400)</w:t>
-      </w:r>
-    </w:p>
-    <w:p>
-      <w:pPr>
-        <w:pStyle w:val="ListBullet"/>
-      </w:pPr>
-      <w:r>
-        <w:t>The task should run once daily (Celery Beat) and also be triggerable manually before each game week</w:t>
-      </w:r>
-    </w:p>
-    <w:p>
-      <w:pPr>
-        <w:pStyle w:val="ListBullet"/>
-      </w:pPr>
-      <w:r>
-        <w:t>Each game entry must include a timezone-aware startDate datetime so get_game_clock_state() can compare it against datetime.now(utc)</w:t>
-      </w:r>
-    </w:p>
-    <w:p>
-      <w:pPr>
-        <w:pStyle w:val="ListBullet"/>
-      </w:pPr>
-      <w:r>
-        <w:t>CFBD_API_KEY must be added as a Heroku config var (already imported in utils.py as cfbd)</w:t>
-      </w:r>
-    </w:p>
-    <w:p>
-      <w:pPr/>
-      <w:r>
-        <w:t>Deadline: must be live before the first UF home game (late August 2026). Without it, all game_clock_state values in the research dataset will be "pre" for the entire season.</w:t>
-      </w:r>
-    </w:p>
-    <w:p>
-      <w:pPr/>
-    </w:p>
-    <w:p>
-      <w:pPr>
-        <w:pStyle w:val="Heading1"/>
-      </w:pPr>
-      <w:r>
-        <w:t>6  Environment Variables Required (Not Yet Set in Heroku)</w:t>
-      </w:r>
-    </w:p>
-    <w:p>
-      <w:pPr>
-        <w:pStyle w:val="ListBullet"/>
-      </w:pPr>
-      <w:r>
-        <w:t>REDIS_URL — Heroku Redis add-on URL. Required for get_game_clock_state() cache and Celery broker. Without it Django falls back to redis://localhost:6379/0 which does not exist on Heroku web dynos, causing 500 errors on /telemetry/phone/ and /telemetry/engagement/. Verify with: heroku config:get REDIS_URL</w:t>
-      </w:r>
-    </w:p>
-    <w:p>
-      <w:pPr>
-        <w:pStyle w:val="ListBullet"/>
-      </w:pPr>
-      <w:r>
-        <w:t>CFBD_API_KEY — College Football Data API key. Required by the forthcoming refresh_game_schedule task (see 5.1). Not yet needed but should be added before season.</w:t>
-      </w:r>
-    </w:p>
-    <w:tbl>
-      <w:tblPr>
-        <w:tblStyle w:val="TableGrid"/>
-        <w:tblW w:type="auto" w:w="0"/>
-        <w:tblLook w:firstColumn="1" w:firstRow="1" w:lastColumn="0" w:lastRow="0" w:noHBand="0" w:noVBand="1" w:val="04A0"/>
-      </w:tblPr>
-      <w:tblGrid>
-        <w:gridCol w:w="2880"/>
-        <w:gridCol w:w="2880"/>
-        <w:gridCol w:w="2880"/>
-      </w:tblGrid>
-      <w:tr>
-        <w:tc>
-          <w:tcPr>
-            <w:tcW w:type="dxa" w:w="2880"/>
-          </w:tcPr>
-          <w:p>
-            <w:r>
-              <w:rPr>
-                <w:b/>
+                <w:sz w:val="18"/>
               </w:rPr>
               <w:t>Variable</w:t>
             </w:r>
@@ -1351,6 +2525,7 @@
             <w:r>
               <w:rPr>
                 <w:b/>
+                <w:sz w:val="18"/>
               </w:rPr>
               <w:t>Used In</w:t>
             </w:r>
@@ -1364,6 +2539,7 @@
             <w:r>
               <w:rPr>
                 <w:b/>
+                <w:sz w:val="18"/>
               </w:rPr>
               <w:t>Description</w:t>
             </w:r>
@@ -1377,6 +2553,10 @@
           </w:tcPr>
           <w:p>
             <w:r>
+              <w:rPr>
+                <w:rFonts w:ascii="Consolas" w:hAnsi="Consolas"/>
+                <w:sz w:val="18"/>
+              </w:rPr>
               <w:t>LABFRONT_API_KEY</w:t>
             </w:r>
           </w:p>
@@ -1387,7 +2567,17 @@
           </w:tcPr>
           <w:p>
             <w:r>
-              <w:t>ingest_wearable_data (pending)</w:t>
+              <w:rPr>
+                <w:rFonts w:ascii="Consolas" w:hAnsi="Consolas"/>
+                <w:sz w:val="18"/>
+              </w:rPr>
+              <w:t>ingest_wearable_data</w:t>
+            </w:r>
+            <w:r>
+              <w:rPr>
+                <w:sz w:val="18"/>
+              </w:rPr>
+              <w:t xml:space="preserve"> (pending)</w:t>
             </w:r>
           </w:p>
         </w:tc>
@@ -1397,6 +2587,9 @@
           </w:tcPr>
           <w:p>
             <w:r>
+              <w:rPr>
+                <w:sz w:val="18"/>
+              </w:rPr>
               <w:t>Study-level Labfront API key</w:t>
             </w:r>
           </w:p>
@@ -1409,6 +2602,10 @@
           </w:tcPr>
           <w:p>
             <w:r>
+              <w:rPr>
+                <w:rFonts w:ascii="Consolas" w:hAnsi="Consolas"/>
+                <w:sz w:val="18"/>
+              </w:rPr>
               <w:t>JITAI_DEFAULT_PROMPT_ID</w:t>
             </w:r>
           </w:p>
@@ -1419,6 +2616,10 @@
           </w:tcPr>
           <w:p>
             <w:r>
+              <w:rPr>
+                <w:rFonts w:ascii="Consolas" w:hAnsi="Consolas"/>
+                <w:sz w:val="18"/>
+              </w:rPr>
               <w:t>notification_service.py</w:t>
             </w:r>
           </w:p>
@@ -1429,6 +2630,9 @@
           </w:tcPr>
           <w:p>
             <w:r>
+              <w:rPr>
+                <w:sz w:val="18"/>
+              </w:rPr>
               <w:t>Default prompt template key sent to mobile app</w:t>
             </w:r>
           </w:p>
@@ -1441,6 +2645,10 @@
           </w:tcPr>
           <w:p>
             <w:r>
+              <w:rPr>
+                <w:rFonts w:ascii="Consolas" w:hAnsi="Consolas"/>
+                <w:sz w:val="18"/>
+              </w:rPr>
               <w:t>JITAI_HR_PROMPT_ID</w:t>
             </w:r>
           </w:p>
@@ -1451,7 +2659,17 @@
           </w:tcPr>
           <w:p>
             <w:r>
-              <w:t>notification_service.py (future)</w:t>
+              <w:rPr>
+                <w:rFonts w:ascii="Consolas" w:hAnsi="Consolas"/>
+                <w:sz w:val="18"/>
+              </w:rPr>
+              <w:t>notification_service.py</w:t>
+            </w:r>
+            <w:r>
+              <w:rPr>
+                <w:sz w:val="18"/>
+              </w:rPr>
+              <w:t xml:space="preserve"> (future)</w:t>
             </w:r>
           </w:p>
         </w:tc>
@@ -1461,6 +2679,9 @@
           </w:tcPr>
           <w:p>
             <w:r>
+              <w:rPr>
+                <w:sz w:val="18"/>
+              </w:rPr>
               <w:t>HR-triggered prompt template key</w:t>
             </w:r>
           </w:p>
@@ -1473,6 +2694,10 @@
           </w:tcPr>
           <w:p>
             <w:r>
+              <w:rPr>
+                <w:rFonts w:ascii="Consolas" w:hAnsi="Consolas"/>
+                <w:sz w:val="18"/>
+              </w:rPr>
               <w:t>JITAI_MOOD_PROMPT_ID</w:t>
             </w:r>
           </w:p>
@@ -1483,7 +2708,17 @@
           </w:tcPr>
           <w:p>
             <w:r>
-              <w:t>notification_service.py (future)</w:t>
+              <w:rPr>
+                <w:rFonts w:ascii="Consolas" w:hAnsi="Consolas"/>
+                <w:sz w:val="18"/>
+              </w:rPr>
+              <w:t>notification_service.py</w:t>
+            </w:r>
+            <w:r>
+              <w:rPr>
+                <w:sz w:val="18"/>
+              </w:rPr>
+              <w:t xml:space="preserve"> (future)</w:t>
             </w:r>
           </w:p>
         </w:tc>
@@ -1493,7 +2728,66 @@
           </w:tcPr>
           <w:p>
             <w:r>
+              <w:rPr>
+                <w:sz w:val="18"/>
+              </w:rPr>
               <w:t>Low-mood prompt template key</w:t>
+            </w:r>
+          </w:p>
+        </w:tc>
+      </w:tr>
+      <w:tr>
+        <w:tc>
+          <w:tcPr>
+            <w:tcW w:type="dxa" w:w="2880"/>
+          </w:tcPr>
+          <w:p>
+            <w:r>
+              <w:rPr>
+                <w:rFonts w:ascii="Consolas" w:hAnsi="Consolas"/>
+                <w:sz w:val="18"/>
+              </w:rPr>
+              <w:t>JITAI_RANDOMIZATION_PROBABILITY</w:t>
+            </w:r>
+          </w:p>
+        </w:tc>
+        <w:tc>
+          <w:tcPr>
+            <w:tcW w:type="dxa" w:w="2880"/>
+          </w:tcPr>
+          <w:p>
+            <w:r>
+              <w:rPr>
+                <w:rFonts w:ascii="Consolas" w:hAnsi="Consolas"/>
+                <w:sz w:val="18"/>
+              </w:rPr>
+              <w:t>tasks.py</w:t>
+            </w:r>
+            <w:r>
+              <w:rPr>
+                <w:sz w:val="18"/>
+              </w:rPr>
+              <w:t xml:space="preserve"> → </w:t>
+            </w:r>
+            <w:r>
+              <w:rPr>
+                <w:rFonts w:ascii="Consolas" w:hAnsi="Consolas"/>
+                <w:sz w:val="18"/>
+              </w:rPr>
+              <w:t>_evaluate_user</w:t>
+            </w:r>
+          </w:p>
+        </w:tc>
+        <w:tc>
+          <w:tcPr>
+            <w:tcW w:type="dxa" w:w="2880"/>
+          </w:tcPr>
+          <w:p>
+            <w:r>
+              <w:rPr>
+                <w:sz w:val="18"/>
+              </w:rPr>
+              <w:t>Randomization probability p — confirmed 0.5 for all participants, whole pilot</w:t>
             </w:r>
           </w:p>
         </w:tc>
@@ -1872,6 +3166,10 @@
     <w:name w:val="Normal"/>
     <w:qFormat/>
     <w:rsid w:val="00FC693F"/>
+    <w:rPr>
+      <w:rFonts w:ascii="Calibri" w:hAnsi="Calibri"/>
+      <w:sz w:val="22"/>
+    </w:rPr>
   </w:style>
   <w:style w:type="paragraph" w:styleId="Header">
     <w:name w:val="header"/>

</xml_diff>

<commit_message>
Fixed notifications routing and scheduled them to correct time frames
</commit_message>
<xml_diff>
--- a/Resources/TODO.docx
+++ b/Resources/TODO.docx
@@ -86,13 +86,13 @@
         <w:pStyle w:val="Heading2"/>
       </w:pPr>
       <w:r>
-        <w:t>Placeholder Values Pending PI Confirmation (check-in reminders)</w:t>
+        <w:t>Check-In Reminders — Confirmed by Dr. Chang (2026-08-21)</w:t>
       </w:r>
     </w:p>
     <w:p>
       <w:pPr/>
       <w:r>
-        <w:t>send_checkin_reminders shipped 2026-08-20 with placeholder constants in app/tasks.py — functional now, values below need Dr. Chang's actual numbers, not guessed defaults:</w:t>
+        <w:t>send_checkin_reminders shipped 2026-08-20, redesigned 2026-08-21 per Dr. Chang's answers below. Two caps that were previously conflated are now separate constants — do not merge them back:</w:t>
       </w:r>
     </w:p>
     <w:p>
@@ -100,7 +100,7 @@
         <w:pStyle w:val="ListBullet"/>
       </w:pPr>
       <w:r>
-        <w:t>Daily check-in count: code caps at 4 (EMA_DAILY_CHECK_IN_CAP, unchanged from before this work); measures document says "about five to six times a day." These disagree — needs a ruling on which is correct before reminders are tuned further.</w:t>
+        <w:t>Two separate caps, not one: SCHEDULED_CHECK_IN_DAILY_CAP = 6 (the B1-B8 rotation check-ins, matching "about five to six times a day" in the measures document) and POST_PROMPT_CHECK_IN_DAILY_CAP = 4 (JITAI-triggered outcome-window check-ins, unchanged — this is a different constant from the JITAI intervention prompt cap in decision_engine.py, apply_decision_rules(max_prompts_per_day=4), which also stays 4 and was never part of this confusion).</w:t>
       </w:r>
     </w:p>
     <w:p>
@@ -108,7 +108,7 @@
         <w:pStyle w:val="ListBullet"/>
       </w:pPr>
       <w:r>
-        <w:t>Reminder cooldown: placeholder 120 minutes (CHECKIN_REMINDER_COOLDOWN_MINUTES in app/tasks.py) between reminders if a participant doesn't respond.</w:t>
+        <w:t>Reminder timing redesigned entirely — not a rolling cooldown. The 6 scheduled check-ins are fixed 2-hour slots across the notification window (9-11, 11-13, ... 19-21 Eastern). Each slot gets at most one reminder, 30 minutes after it opens (CHECKIN_REMINDER_DELAY_MINUTES in app/tasks.py), only if that slot's check-in hasn't already been completed. If it's still not done by the time the slot's window closes, the reminder lapses — no repeat nudging. Rationale (Dr. Chang): a missed check-in is data; repeated nudges both annoy participants and contaminate the missingness pattern. Every reminder is logged with its timestamp and which slot it was for (CheckinReminder.daily_count_at_send), so analysis can distinguish a check-in completed after a nudge from a spontaneous one. Guard: no reminder within 30 min of a JITAI intervention push ("one buzz at a time") — the existing 2-hour active-outcome-window skip already covers this with margin.</w:t>
       </w:r>
     </w:p>
     <w:p>
@@ -116,7 +116,7 @@
         <w:pStyle w:val="ListBullet"/>
       </w:pPr>
       <w:r>
-        <w:t>Waking-hours window: placeholder 9am–9pm Eastern (CHECKIN_REMINDER_WINDOW_START_HOUR/END_HOUR in app/tasks.py) — no reminders sent outside this window.</w:t>
+        <w:t>Notification window confirmed: 9am-9pm Eastern (default was already correct). Renamed the constant to NOTIFICATION_WINDOW_START_HOUR/END_HOUR per Dr. Chang — Abigail's wear-time denominator uses a separate "waking window" concept for a different purpose; do not reuse one constant for both.</w:t>
       </w:r>
     </w:p>
     <w:p>

</xml_diff>